<commit_message>
upload teste de hipóteses
</commit_message>
<xml_diff>
--- a/Ementa_MQAPP_2026.2.docx
+++ b/Ementa_MQAPP_2026.2.docx
@@ -49,7 +49,6 @@
                 <w:szCs w:val="20"/>
               </w:rPr>
             </w:pPr>
-            <w:proofErr w:type="spellStart"/>
             <w:r>
               <w:rPr>
                 <w:rFonts w:ascii="Arial" w:hAnsi="Arial" w:cs="Arial"/>
@@ -58,18 +57,7 @@
                 <w:sz w:val="20"/>
                 <w:szCs w:val="20"/>
               </w:rPr>
-              <w:t>Horário</w:t>
-            </w:r>
-            <w:proofErr w:type="spellEnd"/>
-            <w:r>
-              <w:rPr>
-                <w:rFonts w:ascii="Arial" w:hAnsi="Arial" w:cs="Arial"/>
-                <w:b/>
-                <w:color w:val="17384D"/>
-                <w:sz w:val="20"/>
-                <w:szCs w:val="20"/>
-              </w:rPr>
-              <w:t xml:space="preserve"> e local</w:t>
+              <w:t>Horário e local</w:t>
             </w:r>
           </w:p>
         </w:tc>
@@ -147,7 +135,6 @@
                 <w:szCs w:val="20"/>
               </w:rPr>
             </w:pPr>
-            <w:proofErr w:type="spellStart"/>
             <w:r>
               <w:rPr>
                 <w:rFonts w:ascii="Arial" w:hAnsi="Arial" w:cs="Arial"/>
@@ -158,7 +145,6 @@
               </w:rPr>
               <w:t>Docente</w:t>
             </w:r>
-            <w:proofErr w:type="spellEnd"/>
           </w:p>
         </w:tc>
         <w:tc>
@@ -324,7 +310,6 @@
                 <w:szCs w:val="20"/>
               </w:rPr>
             </w:pPr>
-            <w:proofErr w:type="spellStart"/>
             <w:r>
               <w:rPr>
                 <w:rFonts w:ascii="Arial" w:hAnsi="Arial" w:cs="Arial"/>
@@ -343,31 +328,8 @@
                 <w:sz w:val="20"/>
                 <w:szCs w:val="20"/>
               </w:rPr>
-              <w:t>ais</w:t>
-            </w:r>
-            <w:proofErr w:type="spellEnd"/>
-            <w:r>
-              <w:rPr>
-                <w:rFonts w:ascii="Arial" w:hAnsi="Arial" w:cs="Arial"/>
-                <w:b/>
-                <w:color w:val="17384D"/>
-                <w:sz w:val="20"/>
-                <w:szCs w:val="20"/>
-              </w:rPr>
-              <w:t xml:space="preserve"> do </w:t>
-            </w:r>
-            <w:proofErr w:type="spellStart"/>
-            <w:r>
-              <w:rPr>
-                <w:rFonts w:ascii="Arial" w:hAnsi="Arial" w:cs="Arial"/>
-                <w:b/>
-                <w:color w:val="17384D"/>
-                <w:sz w:val="20"/>
-                <w:szCs w:val="20"/>
-              </w:rPr>
-              <w:t>curso</w:t>
-            </w:r>
-            <w:proofErr w:type="spellEnd"/>
+              <w:t>ais do curso</w:t>
+            </w:r>
           </w:p>
         </w:tc>
         <w:tc>
@@ -435,7 +397,6 @@
                 <w:szCs w:val="20"/>
               </w:rPr>
             </w:pPr>
-            <w:proofErr w:type="spellStart"/>
             <w:r>
               <w:rPr>
                 <w:rFonts w:ascii="Arial" w:hAnsi="Arial" w:cs="Arial"/>
@@ -444,31 +405,8 @@
                 <w:sz w:val="20"/>
                 <w:szCs w:val="20"/>
               </w:rPr>
-              <w:t>Horário</w:t>
-            </w:r>
-            <w:proofErr w:type="spellEnd"/>
-            <w:r>
-              <w:rPr>
-                <w:rFonts w:ascii="Arial" w:hAnsi="Arial" w:cs="Arial"/>
-                <w:b/>
-                <w:color w:val="17384D"/>
-                <w:sz w:val="20"/>
-                <w:szCs w:val="20"/>
-              </w:rPr>
-              <w:t xml:space="preserve"> de </w:t>
-            </w:r>
-            <w:proofErr w:type="spellStart"/>
-            <w:r>
-              <w:rPr>
-                <w:rFonts w:ascii="Arial" w:hAnsi="Arial" w:cs="Arial"/>
-                <w:b/>
-                <w:color w:val="17384D"/>
-                <w:sz w:val="20"/>
-                <w:szCs w:val="20"/>
-              </w:rPr>
-              <w:t>atendimento</w:t>
-            </w:r>
-            <w:proofErr w:type="spellEnd"/>
+              <w:t>Horário de atendimento</w:t>
+            </w:r>
           </w:p>
         </w:tc>
         <w:tc>
@@ -819,34 +757,14 @@
           <w:szCs w:val="20"/>
         </w:rPr>
       </w:pPr>
-      <w:proofErr w:type="spellStart"/>
       <w:r>
         <w:rPr>
           <w:rFonts w:ascii="Arial" w:hAnsi="Arial" w:cs="Arial"/>
           <w:sz w:val="20"/>
           <w:szCs w:val="20"/>
         </w:rPr>
-        <w:t>Introdução</w:t>
+        <w:t>Introdução à estatística</w:t>
       </w:r>
-      <w:proofErr w:type="spellEnd"/>
-      <w:r>
-        <w:rPr>
-          <w:rFonts w:ascii="Arial" w:hAnsi="Arial" w:cs="Arial"/>
-          <w:sz w:val="20"/>
-          <w:szCs w:val="20"/>
-        </w:rPr>
-        <w:t xml:space="preserve"> à </w:t>
-      </w:r>
-      <w:proofErr w:type="spellStart"/>
-      <w:r>
-        <w:rPr>
-          <w:rFonts w:ascii="Arial" w:hAnsi="Arial" w:cs="Arial"/>
-          <w:sz w:val="20"/>
-          <w:szCs w:val="20"/>
-        </w:rPr>
-        <w:t>estatística</w:t>
-      </w:r>
-      <w:proofErr w:type="spellEnd"/>
     </w:p>
     <w:p>
       <w:pPr>
@@ -859,7 +777,6 @@
           <w:szCs w:val="20"/>
         </w:rPr>
       </w:pPr>
-      <w:proofErr w:type="spellStart"/>
       <w:r>
         <w:rPr>
           <w:rFonts w:ascii="Arial" w:hAnsi="Arial" w:cs="Arial"/>
@@ -868,7 +785,6 @@
         </w:rPr>
         <w:t>Probabilidade</w:t>
       </w:r>
-      <w:proofErr w:type="spellEnd"/>
     </w:p>
     <w:p>
       <w:pPr>
@@ -903,34 +819,14 @@
           <w:szCs w:val="20"/>
         </w:rPr>
       </w:pPr>
-      <w:proofErr w:type="spellStart"/>
       <w:r>
         <w:rPr>
           <w:rFonts w:ascii="Arial" w:hAnsi="Arial" w:cs="Arial"/>
           <w:sz w:val="20"/>
           <w:szCs w:val="20"/>
         </w:rPr>
-        <w:t>Correlação</w:t>
+        <w:t>Correlação e regressão</w:t>
       </w:r>
-      <w:proofErr w:type="spellEnd"/>
-      <w:r>
-        <w:rPr>
-          <w:rFonts w:ascii="Arial" w:hAnsi="Arial" w:cs="Arial"/>
-          <w:sz w:val="20"/>
-          <w:szCs w:val="20"/>
-        </w:rPr>
-        <w:t xml:space="preserve"> e </w:t>
-      </w:r>
-      <w:proofErr w:type="spellStart"/>
-      <w:r>
-        <w:rPr>
-          <w:rFonts w:ascii="Arial" w:hAnsi="Arial" w:cs="Arial"/>
-          <w:sz w:val="20"/>
-          <w:szCs w:val="20"/>
-        </w:rPr>
-        <w:t>regressão</w:t>
-      </w:r>
-      <w:proofErr w:type="spellEnd"/>
     </w:p>
     <w:p>
       <w:pPr>
@@ -941,34 +837,14 @@
           <w:szCs w:val="20"/>
         </w:rPr>
       </w:pPr>
-      <w:proofErr w:type="spellStart"/>
       <w:r>
         <w:rPr>
           <w:rFonts w:ascii="Arial" w:hAnsi="Arial" w:cs="Arial"/>
           <w:sz w:val="20"/>
           <w:szCs w:val="20"/>
         </w:rPr>
-        <w:t>Bibliografia</w:t>
+        <w:t>Bibliografia básica</w:t>
       </w:r>
-      <w:proofErr w:type="spellEnd"/>
-      <w:r>
-        <w:rPr>
-          <w:rFonts w:ascii="Arial" w:hAnsi="Arial" w:cs="Arial"/>
-          <w:sz w:val="20"/>
-          <w:szCs w:val="20"/>
-        </w:rPr>
-        <w:t xml:space="preserve"> </w:t>
-      </w:r>
-      <w:proofErr w:type="spellStart"/>
-      <w:r>
-        <w:rPr>
-          <w:rFonts w:ascii="Arial" w:hAnsi="Arial" w:cs="Arial"/>
-          <w:sz w:val="20"/>
-          <w:szCs w:val="20"/>
-        </w:rPr>
-        <w:t>básica</w:t>
-      </w:r>
-      <w:proofErr w:type="spellEnd"/>
     </w:p>
     <w:p>
       <w:pPr>
@@ -1113,29 +989,7 @@
           <w:szCs w:val="20"/>
           <w:lang w:val="pt-BR"/>
         </w:rPr>
-        <w:t xml:space="preserve">WOOLDRIDGE, J. Introdução à econometria: Uma abordagem moderna. São Paulo, </w:t>
-      </w:r>
-      <w:proofErr w:type="spellStart"/>
-      <w:r>
-        <w:rPr>
-          <w:rFonts w:ascii="Arial" w:eastAsia="Times New Roman" w:hAnsi="Arial" w:cs="Arial"/>
-          <w:bCs/>
-          <w:sz w:val="20"/>
-          <w:szCs w:val="20"/>
-          <w:lang w:val="pt-BR"/>
-        </w:rPr>
-        <w:t>Cengage</w:t>
-      </w:r>
-      <w:proofErr w:type="spellEnd"/>
-      <w:r>
-        <w:rPr>
-          <w:rFonts w:ascii="Arial" w:eastAsia="Times New Roman" w:hAnsi="Arial" w:cs="Arial"/>
-          <w:bCs/>
-          <w:sz w:val="20"/>
-          <w:szCs w:val="20"/>
-          <w:lang w:val="pt-BR"/>
-        </w:rPr>
-        <w:t xml:space="preserve">, 2016. </w:t>
+        <w:t xml:space="preserve">WOOLDRIDGE, J. Introdução à econometria: Uma abordagem moderna. São Paulo, Cengage, 2016. </w:t>
       </w:r>
       <w:r>
         <w:rPr>
@@ -1193,31 +1047,7 @@
           <w:shd w:val="clear" w:color="auto" w:fill="FFFFFF"/>
           <w:lang w:val="pt-BR"/>
         </w:rPr>
-        <w:t xml:space="preserve">KELLSTEDT, Paul M.; WHITTEN, Guy D. Fundamentos da pesquisa em ciência política. Editora </w:t>
-      </w:r>
-      <w:proofErr w:type="spellStart"/>
-      <w:r>
-        <w:rPr>
-          <w:rFonts w:ascii="Arial" w:hAnsi="Arial" w:cs="Arial"/>
-          <w:color w:val="222222"/>
-          <w:sz w:val="20"/>
-          <w:szCs w:val="20"/>
-          <w:shd w:val="clear" w:color="auto" w:fill="FFFFFF"/>
-          <w:lang w:val="pt-BR"/>
-        </w:rPr>
-        <w:t>Blucher</w:t>
-      </w:r>
-      <w:proofErr w:type="spellEnd"/>
-      <w:r>
-        <w:rPr>
-          <w:rFonts w:ascii="Arial" w:hAnsi="Arial" w:cs="Arial"/>
-          <w:color w:val="222222"/>
-          <w:sz w:val="20"/>
-          <w:szCs w:val="20"/>
-          <w:shd w:val="clear" w:color="auto" w:fill="FFFFFF"/>
-          <w:lang w:val="pt-BR"/>
-        </w:rPr>
-        <w:t>, 2015.</w:t>
+        <w:t>KELLSTEDT, Paul M.; WHITTEN, Guy D. Fundamentos da pesquisa em ciência política. Editora Blucher, 2015.</w:t>
       </w:r>
       <w:r>
         <w:rPr>
@@ -1305,31 +1135,7 @@
           <w:szCs w:val="20"/>
           <w:lang w:val="pt-BR"/>
         </w:rPr>
-        <w:t xml:space="preserve">Boston, MA, USA: </w:t>
-      </w:r>
-      <w:proofErr w:type="spellStart"/>
-      <w:r>
-        <w:rPr>
-          <w:rFonts w:ascii="Arial" w:eastAsia="Times New Roman" w:hAnsi="Arial" w:cs="Arial"/>
-          <w:bCs/>
-          <w:color w:val="auto"/>
-          <w:sz w:val="20"/>
-          <w:szCs w:val="20"/>
-          <w:lang w:val="pt-BR"/>
-        </w:rPr>
-        <w:t>Cengage</w:t>
-      </w:r>
-      <w:proofErr w:type="spellEnd"/>
-      <w:r>
-        <w:rPr>
-          <w:rFonts w:ascii="Arial" w:eastAsia="Times New Roman" w:hAnsi="Arial" w:cs="Arial"/>
-          <w:bCs/>
-          <w:color w:val="auto"/>
-          <w:sz w:val="20"/>
-          <w:szCs w:val="20"/>
-          <w:lang w:val="pt-BR"/>
-        </w:rPr>
-        <w:t>, 2021.</w:t>
+        <w:t>Boston, MA, USA: Cengage, 2021.</w:t>
       </w:r>
     </w:p>
     <w:p>
@@ -1378,27 +1184,7 @@
           <w:szCs w:val="20"/>
           <w:lang w:val="pt-BR"/>
         </w:rPr>
-        <w:t xml:space="preserve">GIL, </w:t>
-      </w:r>
-      <w:proofErr w:type="spellStart"/>
-      <w:r>
-        <w:rPr>
-          <w:rFonts w:ascii="Arial" w:hAnsi="Arial" w:cs="Arial"/>
-          <w:sz w:val="20"/>
-          <w:szCs w:val="20"/>
-          <w:lang w:val="pt-BR"/>
-        </w:rPr>
-        <w:t>Antonio</w:t>
-      </w:r>
-      <w:proofErr w:type="spellEnd"/>
-      <w:r>
-        <w:rPr>
-          <w:rFonts w:ascii="Arial" w:hAnsi="Arial" w:cs="Arial"/>
-          <w:sz w:val="20"/>
-          <w:szCs w:val="20"/>
-          <w:lang w:val="pt-BR"/>
-        </w:rPr>
-        <w:t xml:space="preserve"> Carlos. Como elaborar projetos de pesquisa. São Paulo, SP: Atlas, 1988. Fonte: </w:t>
+        <w:t xml:space="preserve">GIL, Antonio Carlos. Como elaborar projetos de pesquisa. São Paulo, SP: Atlas, 1988. Fonte: </w:t>
       </w:r>
       <w:hyperlink r:id="rId14" w:history="1">
         <w:r>
@@ -1902,7 +1688,6 @@
           <w:szCs w:val="20"/>
         </w:rPr>
       </w:pPr>
-      <w:proofErr w:type="spellStart"/>
       <w:r>
         <w:rPr>
           <w:rFonts w:ascii="Arial" w:hAnsi="Arial" w:cs="Arial"/>
@@ -1911,7 +1696,6 @@
         </w:rPr>
         <w:t>Avaliação</w:t>
       </w:r>
-      <w:proofErr w:type="spellEnd"/>
     </w:p>
     <w:tbl>
       <w:tblPr>
@@ -1950,7 +1734,6 @@
                 <w:szCs w:val="20"/>
               </w:rPr>
             </w:pPr>
-            <w:proofErr w:type="spellStart"/>
             <w:r>
               <w:rPr>
                 <w:rFonts w:ascii="Arial" w:hAnsi="Arial" w:cs="Arial"/>
@@ -1961,7 +1744,6 @@
               </w:rPr>
               <w:t>Componente</w:t>
             </w:r>
-            <w:proofErr w:type="spellEnd"/>
           </w:p>
         </w:tc>
         <w:tc>
@@ -1984,7 +1766,6 @@
                 <w:szCs w:val="20"/>
               </w:rPr>
             </w:pPr>
-            <w:proofErr w:type="spellStart"/>
             <w:r>
               <w:rPr>
                 <w:rFonts w:ascii="Arial" w:hAnsi="Arial" w:cs="Arial"/>
@@ -1995,7 +1776,6 @@
               </w:rPr>
               <w:t>Pontuação</w:t>
             </w:r>
-            <w:proofErr w:type="spellEnd"/>
           </w:p>
         </w:tc>
       </w:tr>
@@ -2039,41 +1819,13 @@
               </w:rPr>
               <w:t xml:space="preserve"> </w:t>
             </w:r>
-            <w:proofErr w:type="spellStart"/>
-            <w:r>
-              <w:rPr>
-                <w:rFonts w:ascii="Arial" w:hAnsi="Arial" w:cs="Arial"/>
-                <w:sz w:val="20"/>
-                <w:szCs w:val="20"/>
-              </w:rPr>
-              <w:t>Listas</w:t>
-            </w:r>
-            <w:proofErr w:type="spellEnd"/>
-            <w:r>
-              <w:rPr>
-                <w:rFonts w:ascii="Arial" w:hAnsi="Arial" w:cs="Arial"/>
-                <w:sz w:val="20"/>
-                <w:szCs w:val="20"/>
-              </w:rPr>
-              <w:t xml:space="preserve"> de </w:t>
-            </w:r>
-            <w:proofErr w:type="spellStart"/>
-            <w:r>
-              <w:rPr>
-                <w:rFonts w:ascii="Arial" w:hAnsi="Arial" w:cs="Arial"/>
-                <w:sz w:val="20"/>
-                <w:szCs w:val="20"/>
-              </w:rPr>
-              <w:t>exercícios</w:t>
-            </w:r>
-            <w:proofErr w:type="spellEnd"/>
-            <w:r>
-              <w:rPr>
-                <w:rFonts w:ascii="Arial" w:hAnsi="Arial" w:cs="Arial"/>
-                <w:sz w:val="20"/>
-                <w:szCs w:val="20"/>
-              </w:rPr>
-              <w:t xml:space="preserve"> (</w:t>
+            <w:r>
+              <w:rPr>
+                <w:rFonts w:ascii="Arial" w:hAnsi="Arial" w:cs="Arial"/>
+                <w:sz w:val="20"/>
+                <w:szCs w:val="20"/>
+              </w:rPr>
+              <w:t>Listas de exercícios (</w:t>
             </w:r>
             <w:r>
               <w:rPr>
@@ -2097,25 +1849,7 @@
                 <w:sz w:val="20"/>
                 <w:szCs w:val="20"/>
               </w:rPr>
-              <w:t xml:space="preserve">5 </w:t>
-            </w:r>
-            <w:proofErr w:type="spellStart"/>
-            <w:r>
-              <w:rPr>
-                <w:rFonts w:ascii="Arial" w:hAnsi="Arial" w:cs="Arial"/>
-                <w:sz w:val="20"/>
-                <w:szCs w:val="20"/>
-              </w:rPr>
-              <w:t>pontos</w:t>
-            </w:r>
-            <w:proofErr w:type="spellEnd"/>
-            <w:r>
-              <w:rPr>
-                <w:rFonts w:ascii="Arial" w:hAnsi="Arial" w:cs="Arial"/>
-                <w:sz w:val="20"/>
-                <w:szCs w:val="20"/>
-              </w:rPr>
-              <w:t>)</w:t>
+              <w:t>5 pontos)</w:t>
             </w:r>
           </w:p>
         </w:tc>
@@ -2160,18 +1894,8 @@
                 <w:sz w:val="20"/>
                 <w:szCs w:val="20"/>
               </w:rPr>
-              <w:t xml:space="preserve"> </w:t>
-            </w:r>
-            <w:proofErr w:type="spellStart"/>
-            <w:r>
-              <w:rPr>
-                <w:rFonts w:ascii="Arial" w:hAnsi="Arial" w:cs="Arial"/>
-                <w:sz w:val="20"/>
-                <w:szCs w:val="20"/>
-              </w:rPr>
-              <w:t>pontos</w:t>
-            </w:r>
-            <w:proofErr w:type="spellEnd"/>
+              <w:t xml:space="preserve"> pontos</w:t>
+            </w:r>
           </w:p>
         </w:tc>
       </w:tr>
@@ -2215,41 +1939,13 @@
               </w:rPr>
               <w:t xml:space="preserve"> </w:t>
             </w:r>
-            <w:proofErr w:type="spellStart"/>
-            <w:r>
-              <w:rPr>
-                <w:rFonts w:ascii="Arial" w:hAnsi="Arial" w:cs="Arial"/>
-                <w:sz w:val="20"/>
-                <w:szCs w:val="20"/>
-              </w:rPr>
-              <w:t>Provas</w:t>
-            </w:r>
-            <w:proofErr w:type="spellEnd"/>
-            <w:r>
-              <w:rPr>
-                <w:rFonts w:ascii="Arial" w:hAnsi="Arial" w:cs="Arial"/>
-                <w:sz w:val="20"/>
-                <w:szCs w:val="20"/>
-              </w:rPr>
-              <w:t xml:space="preserve"> das </w:t>
-            </w:r>
-            <w:proofErr w:type="spellStart"/>
-            <w:r>
-              <w:rPr>
-                <w:rFonts w:ascii="Arial" w:hAnsi="Arial" w:cs="Arial"/>
-                <w:sz w:val="20"/>
-                <w:szCs w:val="20"/>
-              </w:rPr>
-              <w:t>unidades</w:t>
-            </w:r>
-            <w:proofErr w:type="spellEnd"/>
-            <w:r>
-              <w:rPr>
-                <w:rFonts w:ascii="Arial" w:hAnsi="Arial" w:cs="Arial"/>
-                <w:sz w:val="20"/>
-                <w:szCs w:val="20"/>
-              </w:rPr>
-              <w:t xml:space="preserve"> (</w:t>
+            <w:r>
+              <w:rPr>
+                <w:rFonts w:ascii="Arial" w:hAnsi="Arial" w:cs="Arial"/>
+                <w:sz w:val="20"/>
+                <w:szCs w:val="20"/>
+              </w:rPr>
+              <w:t>Provas das unidades (</w:t>
             </w:r>
             <w:r>
               <w:rPr>
@@ -2289,16 +1985,7 @@
                 <w:sz w:val="20"/>
                 <w:szCs w:val="20"/>
               </w:rPr>
-              <w:t xml:space="preserve"> </w:t>
-            </w:r>
-            <w:proofErr w:type="spellStart"/>
-            <w:r>
-              <w:rPr>
-                <w:rFonts w:ascii="Arial" w:hAnsi="Arial" w:cs="Arial"/>
-                <w:sz w:val="20"/>
-                <w:szCs w:val="20"/>
-              </w:rPr>
-              <w:t>pont</w:t>
+              <w:t xml:space="preserve"> pont</w:t>
             </w:r>
             <w:r>
               <w:rPr>
@@ -2308,7 +1995,6 @@
               </w:rPr>
               <w:t>os</w:t>
             </w:r>
-            <w:proofErr w:type="spellEnd"/>
             <w:r>
               <w:rPr>
                 <w:rFonts w:ascii="Arial" w:hAnsi="Arial" w:cs="Arial"/>
@@ -2360,18 +2046,8 @@
                 <w:sz w:val="20"/>
                 <w:szCs w:val="20"/>
               </w:rPr>
-              <w:t xml:space="preserve"> </w:t>
-            </w:r>
-            <w:proofErr w:type="spellStart"/>
-            <w:r>
-              <w:rPr>
-                <w:rFonts w:ascii="Arial" w:hAnsi="Arial" w:cs="Arial"/>
-                <w:sz w:val="20"/>
-                <w:szCs w:val="20"/>
-              </w:rPr>
-              <w:t>pontos</w:t>
-            </w:r>
-            <w:proofErr w:type="spellEnd"/>
+              <w:t xml:space="preserve"> pontos</w:t>
+            </w:r>
           </w:p>
         </w:tc>
       </w:tr>
@@ -2399,23 +2075,13 @@
                 <w:szCs w:val="20"/>
               </w:rPr>
             </w:pPr>
-            <w:proofErr w:type="spellStart"/>
-            <w:r>
-              <w:rPr>
-                <w:rFonts w:ascii="Arial" w:hAnsi="Arial" w:cs="Arial"/>
-                <w:sz w:val="20"/>
-                <w:szCs w:val="20"/>
-              </w:rPr>
-              <w:t>Prova</w:t>
-            </w:r>
-            <w:proofErr w:type="spellEnd"/>
-            <w:r>
-              <w:rPr>
-                <w:rFonts w:ascii="Arial" w:hAnsi="Arial" w:cs="Arial"/>
-                <w:sz w:val="20"/>
-                <w:szCs w:val="20"/>
-              </w:rPr>
-              <w:t xml:space="preserve"> final</w:t>
+            <w:r>
+              <w:rPr>
+                <w:rFonts w:ascii="Arial" w:hAnsi="Arial" w:cs="Arial"/>
+                <w:sz w:val="20"/>
+                <w:szCs w:val="20"/>
+              </w:rPr>
+              <w:t>Prova final</w:t>
             </w:r>
           </w:p>
         </w:tc>
@@ -2438,41 +2104,13 @@
                 <w:szCs w:val="20"/>
               </w:rPr>
             </w:pPr>
-            <w:proofErr w:type="spellStart"/>
-            <w:r>
-              <w:rPr>
-                <w:rFonts w:ascii="Arial" w:hAnsi="Arial" w:cs="Arial"/>
-                <w:sz w:val="20"/>
-                <w:szCs w:val="20"/>
-              </w:rPr>
-              <w:t>Substituta</w:t>
-            </w:r>
-            <w:proofErr w:type="spellEnd"/>
-            <w:r>
-              <w:rPr>
-                <w:rFonts w:ascii="Arial" w:hAnsi="Arial" w:cs="Arial"/>
-                <w:sz w:val="20"/>
-                <w:szCs w:val="20"/>
-              </w:rPr>
-              <w:t xml:space="preserve"> da </w:t>
-            </w:r>
-            <w:proofErr w:type="spellStart"/>
-            <w:r>
-              <w:rPr>
-                <w:rFonts w:ascii="Arial" w:hAnsi="Arial" w:cs="Arial"/>
-                <w:sz w:val="20"/>
-                <w:szCs w:val="20"/>
-              </w:rPr>
-              <w:t>menor</w:t>
-            </w:r>
-            <w:proofErr w:type="spellEnd"/>
-            <w:r>
-              <w:rPr>
-                <w:rFonts w:ascii="Arial" w:hAnsi="Arial" w:cs="Arial"/>
-                <w:sz w:val="20"/>
-                <w:szCs w:val="20"/>
-              </w:rPr>
-              <w:t xml:space="preserve"> nota</w:t>
+            <w:r>
+              <w:rPr>
+                <w:rFonts w:ascii="Arial" w:hAnsi="Arial" w:cs="Arial"/>
+                <w:sz w:val="20"/>
+                <w:szCs w:val="20"/>
+              </w:rPr>
+              <w:t>Substituta da menor nota</w:t>
             </w:r>
           </w:p>
         </w:tc>
@@ -2549,19 +2187,8 @@
                 <w:sz w:val="20"/>
                 <w:szCs w:val="20"/>
               </w:rPr>
-              <w:t xml:space="preserve"> </w:t>
-            </w:r>
-            <w:proofErr w:type="spellStart"/>
-            <w:r>
-              <w:rPr>
-                <w:rFonts w:ascii="Arial" w:hAnsi="Arial" w:cs="Arial"/>
-                <w:b/>
-                <w:sz w:val="20"/>
-                <w:szCs w:val="20"/>
-              </w:rPr>
-              <w:t>pontos</w:t>
-            </w:r>
-            <w:proofErr w:type="spellEnd"/>
+              <w:t xml:space="preserve"> pontos</w:t>
+            </w:r>
           </w:p>
         </w:tc>
       </w:tr>
@@ -2819,51 +2446,15 @@
           <w:sz w:val="20"/>
           <w:szCs w:val="20"/>
         </w:rPr>
-        <w:t xml:space="preserve">Avisos </w:t>
+        <w:t>Avisos n</w:t>
       </w:r>
-      <w:proofErr w:type="spellStart"/>
       <w:r>
         <w:rPr>
           <w:rFonts w:ascii="Arial" w:hAnsi="Arial" w:cs="Arial"/>
           <w:sz w:val="20"/>
           <w:szCs w:val="20"/>
         </w:rPr>
-        <w:t>n</w:t>
-      </w:r>
-      <w:r>
-        <w:rPr>
-          <w:rFonts w:ascii="Arial" w:hAnsi="Arial" w:cs="Arial"/>
-          <w:sz w:val="20"/>
-          <w:szCs w:val="20"/>
-        </w:rPr>
-        <w:t>a</w:t>
-      </w:r>
-      <w:proofErr w:type="spellEnd"/>
-      <w:r>
-        <w:rPr>
-          <w:rFonts w:ascii="Arial" w:hAnsi="Arial" w:cs="Arial"/>
-          <w:sz w:val="20"/>
-          <w:szCs w:val="20"/>
-        </w:rPr>
-        <w:t xml:space="preserve"> </w:t>
-      </w:r>
-      <w:proofErr w:type="spellStart"/>
-      <w:r>
-        <w:rPr>
-          <w:rFonts w:ascii="Arial" w:hAnsi="Arial" w:cs="Arial"/>
-          <w:sz w:val="20"/>
-          <w:szCs w:val="20"/>
-        </w:rPr>
-        <w:t>plataforma</w:t>
-      </w:r>
-      <w:proofErr w:type="spellEnd"/>
-      <w:r>
-        <w:rPr>
-          <w:rFonts w:ascii="Arial" w:hAnsi="Arial" w:cs="Arial"/>
-          <w:sz w:val="20"/>
-          <w:szCs w:val="20"/>
-        </w:rPr>
-        <w:t xml:space="preserve"> online</w:t>
+        <w:t>a plataforma online</w:t>
       </w:r>
     </w:p>
     <w:p>
@@ -2886,36 +2477,8 @@
           <w:sz w:val="20"/>
           <w:szCs w:val="20"/>
         </w:rPr>
-        <w:t xml:space="preserve">Seus </w:t>
+        <w:t>Seus colegas de turma</w:t>
       </w:r>
-      <w:proofErr w:type="spellStart"/>
-      <w:r>
-        <w:rPr>
-          <w:rFonts w:ascii="Arial" w:hAnsi="Arial" w:cs="Arial"/>
-          <w:sz w:val="20"/>
-          <w:szCs w:val="20"/>
-        </w:rPr>
-        <w:t>colegas</w:t>
-      </w:r>
-      <w:proofErr w:type="spellEnd"/>
-      <w:r>
-        <w:rPr>
-          <w:rFonts w:ascii="Arial" w:hAnsi="Arial" w:cs="Arial"/>
-          <w:sz w:val="20"/>
-          <w:szCs w:val="20"/>
-        </w:rPr>
-        <w:t xml:space="preserve"> de </w:t>
-      </w:r>
-      <w:proofErr w:type="spellStart"/>
-      <w:r>
-        <w:rPr>
-          <w:rFonts w:ascii="Arial" w:hAnsi="Arial" w:cs="Arial"/>
-          <w:sz w:val="20"/>
-          <w:szCs w:val="20"/>
-        </w:rPr>
-        <w:t>turma</w:t>
-      </w:r>
-      <w:proofErr w:type="spellEnd"/>
       <w:r>
         <w:rPr>
           <w:rFonts w:ascii="Arial" w:hAnsi="Arial" w:cs="Arial"/>
@@ -3331,42 +2894,8 @@
                 <w:sz w:val="20"/>
                 <w:szCs w:val="20"/>
               </w:rPr>
-              <w:t xml:space="preserve">Tema, </w:t>
-            </w:r>
-            <w:proofErr w:type="spellStart"/>
-            <w:r>
-              <w:rPr>
-                <w:rFonts w:ascii="Arial" w:hAnsi="Arial" w:cs="Arial"/>
-                <w:b/>
-                <w:color w:val="FFFFFF"/>
-                <w:sz w:val="20"/>
-                <w:szCs w:val="20"/>
-              </w:rPr>
-              <w:t>atividade</w:t>
-            </w:r>
-            <w:proofErr w:type="spellEnd"/>
-            <w:r>
-              <w:rPr>
-                <w:rFonts w:ascii="Arial" w:hAnsi="Arial" w:cs="Arial"/>
-                <w:b/>
-                <w:color w:val="FFFFFF"/>
-                <w:sz w:val="20"/>
-                <w:szCs w:val="20"/>
-              </w:rPr>
-              <w:t xml:space="preserve"> e </w:t>
-            </w:r>
-            <w:proofErr w:type="spellStart"/>
-            <w:r>
-              <w:rPr>
-                <w:rFonts w:ascii="Arial" w:hAnsi="Arial" w:cs="Arial"/>
-                <w:b/>
-                <w:color w:val="FFFFFF"/>
-                <w:sz w:val="20"/>
-                <w:szCs w:val="20"/>
-              </w:rPr>
-              <w:t>leitura</w:t>
-            </w:r>
-            <w:proofErr w:type="spellEnd"/>
+              <w:t>Tema, atividade e leitura</w:t>
+            </w:r>
           </w:p>
         </w:tc>
       </w:tr>
@@ -3553,46 +3082,7 @@
                 <w:lang w:val="pt-BR"/>
               </w:rPr>
               <w:br/>
-            </w:r>
-            <w:proofErr w:type="spellStart"/>
-            <w:r>
-              <w:rPr>
-                <w:rFonts w:ascii="Arial" w:hAnsi="Arial" w:cs="Arial"/>
-                <w:sz w:val="20"/>
-                <w:szCs w:val="20"/>
-                <w:lang w:val="pt-BR"/>
-              </w:rPr>
-              <w:t>Gravetter</w:t>
-            </w:r>
-            <w:proofErr w:type="spellEnd"/>
-            <w:r>
-              <w:rPr>
-                <w:rFonts w:ascii="Arial" w:hAnsi="Arial" w:cs="Arial"/>
-                <w:sz w:val="20"/>
-                <w:szCs w:val="20"/>
-                <w:lang w:val="pt-BR"/>
-              </w:rPr>
-              <w:t xml:space="preserve"> &amp; </w:t>
-            </w:r>
-            <w:proofErr w:type="spellStart"/>
-            <w:r>
-              <w:rPr>
-                <w:rFonts w:ascii="Arial" w:hAnsi="Arial" w:cs="Arial"/>
-                <w:sz w:val="20"/>
-                <w:szCs w:val="20"/>
-                <w:lang w:val="pt-BR"/>
-              </w:rPr>
-              <w:t>Wallnau</w:t>
-            </w:r>
-            <w:proofErr w:type="spellEnd"/>
-            <w:r>
-              <w:rPr>
-                <w:rFonts w:ascii="Arial" w:hAnsi="Arial" w:cs="Arial"/>
-                <w:sz w:val="20"/>
-                <w:szCs w:val="20"/>
-                <w:lang w:val="pt-BR"/>
-              </w:rPr>
-              <w:t>, capítulo 1</w:t>
+              <w:t>Gravetter &amp; Wallnau, capítulo 1</w:t>
             </w:r>
           </w:p>
         </w:tc>
@@ -3682,46 +3172,7 @@
                 <w:lang w:val="pt-BR"/>
               </w:rPr>
               <w:br/>
-            </w:r>
-            <w:proofErr w:type="spellStart"/>
-            <w:r>
-              <w:rPr>
-                <w:rFonts w:ascii="Arial" w:hAnsi="Arial" w:cs="Arial"/>
-                <w:sz w:val="20"/>
-                <w:szCs w:val="20"/>
-                <w:lang w:val="pt-BR"/>
-              </w:rPr>
-              <w:t>Gravetter</w:t>
-            </w:r>
-            <w:proofErr w:type="spellEnd"/>
-            <w:r>
-              <w:rPr>
-                <w:rFonts w:ascii="Arial" w:hAnsi="Arial" w:cs="Arial"/>
-                <w:sz w:val="20"/>
-                <w:szCs w:val="20"/>
-                <w:lang w:val="pt-BR"/>
-              </w:rPr>
-              <w:t xml:space="preserve"> &amp; </w:t>
-            </w:r>
-            <w:proofErr w:type="spellStart"/>
-            <w:r>
-              <w:rPr>
-                <w:rFonts w:ascii="Arial" w:hAnsi="Arial" w:cs="Arial"/>
-                <w:sz w:val="20"/>
-                <w:szCs w:val="20"/>
-                <w:lang w:val="pt-BR"/>
-              </w:rPr>
-              <w:t>Wallnau</w:t>
-            </w:r>
-            <w:proofErr w:type="spellEnd"/>
-            <w:r>
-              <w:rPr>
-                <w:rFonts w:ascii="Arial" w:hAnsi="Arial" w:cs="Arial"/>
-                <w:sz w:val="20"/>
-                <w:szCs w:val="20"/>
-                <w:lang w:val="pt-BR"/>
-              </w:rPr>
-              <w:t>, capítulo 2 (exceto a seção 2.5)</w:t>
+              <w:t>Gravetter &amp; Wallnau, capítulo 2 (exceto a seção 2.5)</w:t>
             </w:r>
           </w:p>
         </w:tc>
@@ -3811,46 +3262,7 @@
                 <w:lang w:val="pt-BR"/>
               </w:rPr>
               <w:br/>
-            </w:r>
-            <w:proofErr w:type="spellStart"/>
-            <w:r>
-              <w:rPr>
-                <w:rFonts w:ascii="Arial" w:hAnsi="Arial" w:cs="Arial"/>
-                <w:sz w:val="20"/>
-                <w:szCs w:val="20"/>
-                <w:lang w:val="pt-BR"/>
-              </w:rPr>
-              <w:t>Gravetter</w:t>
-            </w:r>
-            <w:proofErr w:type="spellEnd"/>
-            <w:r>
-              <w:rPr>
-                <w:rFonts w:ascii="Arial" w:hAnsi="Arial" w:cs="Arial"/>
-                <w:sz w:val="20"/>
-                <w:szCs w:val="20"/>
-                <w:lang w:val="pt-BR"/>
-              </w:rPr>
-              <w:t xml:space="preserve"> &amp; </w:t>
-            </w:r>
-            <w:proofErr w:type="spellStart"/>
-            <w:r>
-              <w:rPr>
-                <w:rFonts w:ascii="Arial" w:hAnsi="Arial" w:cs="Arial"/>
-                <w:sz w:val="20"/>
-                <w:szCs w:val="20"/>
-                <w:lang w:val="pt-BR"/>
-              </w:rPr>
-              <w:t>Wallnau</w:t>
-            </w:r>
-            <w:proofErr w:type="spellEnd"/>
-            <w:r>
-              <w:rPr>
-                <w:rFonts w:ascii="Arial" w:hAnsi="Arial" w:cs="Arial"/>
-                <w:sz w:val="20"/>
-                <w:szCs w:val="20"/>
-                <w:lang w:val="pt-BR"/>
-              </w:rPr>
-              <w:t>, capítulo 3</w:t>
+              <w:t>Gravetter &amp; Wallnau, capítulo 3</w:t>
             </w:r>
           </w:p>
         </w:tc>
@@ -3923,7 +3335,6 @@
                 <w:lang w:val="pt-BR"/>
               </w:rPr>
             </w:pPr>
-            <w:proofErr w:type="spellStart"/>
             <w:r>
               <w:rPr>
                 <w:rFonts w:ascii="Arial" w:hAnsi="Arial" w:cs="Arial"/>
@@ -3932,7 +3343,6 @@
               </w:rPr>
               <w:t>Variabilidade</w:t>
             </w:r>
-            <w:proofErr w:type="spellEnd"/>
             <w:r>
               <w:rPr>
                 <w:rFonts w:ascii="Arial" w:hAnsi="Arial" w:cs="Arial"/>
@@ -3940,42 +3350,7 @@
                 <w:szCs w:val="20"/>
               </w:rPr>
               <w:br/>
-            </w:r>
-            <w:proofErr w:type="spellStart"/>
-            <w:r>
-              <w:rPr>
-                <w:rFonts w:ascii="Arial" w:hAnsi="Arial" w:cs="Arial"/>
-                <w:sz w:val="20"/>
-                <w:szCs w:val="20"/>
-              </w:rPr>
-              <w:t>Gravetter</w:t>
-            </w:r>
-            <w:proofErr w:type="spellEnd"/>
-            <w:r>
-              <w:rPr>
-                <w:rFonts w:ascii="Arial" w:hAnsi="Arial" w:cs="Arial"/>
-                <w:sz w:val="20"/>
-                <w:szCs w:val="20"/>
-              </w:rPr>
-              <w:t xml:space="preserve"> &amp; Wallnau, </w:t>
-            </w:r>
-            <w:proofErr w:type="spellStart"/>
-            <w:r>
-              <w:rPr>
-                <w:rFonts w:ascii="Arial" w:hAnsi="Arial" w:cs="Arial"/>
-                <w:sz w:val="20"/>
-                <w:szCs w:val="20"/>
-              </w:rPr>
-              <w:t>capítulo</w:t>
-            </w:r>
-            <w:proofErr w:type="spellEnd"/>
-            <w:r>
-              <w:rPr>
-                <w:rFonts w:ascii="Arial" w:hAnsi="Arial" w:cs="Arial"/>
-                <w:sz w:val="20"/>
-                <w:szCs w:val="20"/>
-              </w:rPr>
-              <w:t xml:space="preserve"> 4</w:t>
+              <w:t>Gravetter &amp; Wallnau, capítulo 4</w:t>
             </w:r>
           </w:p>
         </w:tc>
@@ -4172,7 +3547,6 @@
                 <w:lang w:val="pt-BR"/>
               </w:rPr>
             </w:pPr>
-            <w:proofErr w:type="spellStart"/>
             <w:r>
               <w:rPr>
                 <w:rFonts w:ascii="Arial" w:hAnsi="Arial" w:cs="Arial"/>
@@ -4182,43 +3556,7 @@
                 <w:sz w:val="20"/>
                 <w:szCs w:val="20"/>
               </w:rPr>
-              <w:t>Prova</w:t>
-            </w:r>
-            <w:proofErr w:type="spellEnd"/>
-            <w:r>
-              <w:rPr>
-                <w:rFonts w:ascii="Arial" w:hAnsi="Arial" w:cs="Arial"/>
-                <w:b/>
-                <w:bCs/>
-                <w:color w:val="00B050"/>
-                <w:sz w:val="20"/>
-                <w:szCs w:val="20"/>
-              </w:rPr>
-              <w:t xml:space="preserve"> da </w:t>
-            </w:r>
-            <w:proofErr w:type="spellStart"/>
-            <w:r>
-              <w:rPr>
-                <w:rFonts w:ascii="Arial" w:hAnsi="Arial" w:cs="Arial"/>
-                <w:b/>
-                <w:bCs/>
-                <w:color w:val="00B050"/>
-                <w:sz w:val="20"/>
-                <w:szCs w:val="20"/>
-              </w:rPr>
-              <w:t>Unidade</w:t>
-            </w:r>
-            <w:proofErr w:type="spellEnd"/>
-            <w:r>
-              <w:rPr>
-                <w:rFonts w:ascii="Arial" w:hAnsi="Arial" w:cs="Arial"/>
-                <w:b/>
-                <w:bCs/>
-                <w:color w:val="00B050"/>
-                <w:sz w:val="20"/>
-                <w:szCs w:val="20"/>
-              </w:rPr>
-              <w:t xml:space="preserve"> 1</w:t>
+              <w:t>Prova da Unidade 1</w:t>
             </w:r>
           </w:p>
         </w:tc>
@@ -4244,60 +3582,30 @@
           <w:szCs w:val="20"/>
         </w:rPr>
       </w:pPr>
-      <w:proofErr w:type="spellStart"/>
       <w:r>
         <w:rPr>
           <w:rFonts w:ascii="Arial" w:hAnsi="Arial" w:cs="Arial"/>
           <w:sz w:val="20"/>
           <w:szCs w:val="20"/>
         </w:rPr>
-        <w:t>Unidade</w:t>
+        <w:t xml:space="preserve">Unidade 2: </w:t>
       </w:r>
-      <w:proofErr w:type="spellEnd"/>
       <w:r>
         <w:rPr>
           <w:rFonts w:ascii="Arial" w:hAnsi="Arial" w:cs="Arial"/>
           <w:sz w:val="20"/>
           <w:szCs w:val="20"/>
         </w:rPr>
-        <w:t xml:space="preserve"> 2: </w:t>
+        <w:t>Introdução à p</w:t>
       </w:r>
-      <w:proofErr w:type="spellStart"/>
       <w:r>
         <w:rPr>
           <w:rFonts w:ascii="Arial" w:hAnsi="Arial" w:cs="Arial"/>
           <w:sz w:val="20"/>
           <w:szCs w:val="20"/>
         </w:rPr>
-        <w:t>Introdução</w:t>
-      </w:r>
-      <w:proofErr w:type="spellEnd"/>
-      <w:r>
-        <w:rPr>
-          <w:rFonts w:ascii="Arial" w:hAnsi="Arial" w:cs="Arial"/>
-          <w:sz w:val="20"/>
-          <w:szCs w:val="20"/>
-        </w:rPr>
-        <w:t xml:space="preserve"> à </w:t>
-      </w:r>
-      <w:proofErr w:type="spellStart"/>
-      <w:r>
-        <w:rPr>
-          <w:rFonts w:ascii="Arial" w:hAnsi="Arial" w:cs="Arial"/>
-          <w:sz w:val="20"/>
-          <w:szCs w:val="20"/>
-        </w:rPr>
-        <w:t>p</w:t>
-      </w:r>
-      <w:r>
-        <w:rPr>
-          <w:rFonts w:ascii="Arial" w:hAnsi="Arial" w:cs="Arial"/>
-          <w:sz w:val="20"/>
-          <w:szCs w:val="20"/>
-        </w:rPr>
         <w:t>robabilidade</w:t>
       </w:r>
-      <w:proofErr w:type="spellEnd"/>
     </w:p>
     <w:tbl>
       <w:tblPr>
@@ -4376,42 +3684,8 @@
                 <w:sz w:val="20"/>
                 <w:szCs w:val="20"/>
               </w:rPr>
-              <w:t xml:space="preserve">Tema, </w:t>
-            </w:r>
-            <w:proofErr w:type="spellStart"/>
-            <w:r>
-              <w:rPr>
-                <w:rFonts w:ascii="Arial" w:hAnsi="Arial" w:cs="Arial"/>
-                <w:b/>
-                <w:color w:val="FFFFFF"/>
-                <w:sz w:val="20"/>
-                <w:szCs w:val="20"/>
-              </w:rPr>
-              <w:t>atividade</w:t>
-            </w:r>
-            <w:proofErr w:type="spellEnd"/>
-            <w:r>
-              <w:rPr>
-                <w:rFonts w:ascii="Arial" w:hAnsi="Arial" w:cs="Arial"/>
-                <w:b/>
-                <w:color w:val="FFFFFF"/>
-                <w:sz w:val="20"/>
-                <w:szCs w:val="20"/>
-              </w:rPr>
-              <w:t xml:space="preserve"> e </w:t>
-            </w:r>
-            <w:proofErr w:type="spellStart"/>
-            <w:r>
-              <w:rPr>
-                <w:rFonts w:ascii="Arial" w:hAnsi="Arial" w:cs="Arial"/>
-                <w:b/>
-                <w:color w:val="FFFFFF"/>
-                <w:sz w:val="20"/>
-                <w:szCs w:val="20"/>
-              </w:rPr>
-              <w:t>leitura</w:t>
-            </w:r>
-            <w:proofErr w:type="spellEnd"/>
+              <w:t>Tema, atividade e leitura</w:t>
+            </w:r>
           </w:p>
         </w:tc>
       </w:tr>
@@ -4607,46 +3881,7 @@
                 <w:lang w:val="pt-BR"/>
               </w:rPr>
               <w:br/>
-            </w:r>
-            <w:proofErr w:type="spellStart"/>
-            <w:r>
-              <w:rPr>
-                <w:rFonts w:ascii="Arial" w:hAnsi="Arial" w:cs="Arial"/>
-                <w:sz w:val="20"/>
-                <w:szCs w:val="20"/>
-                <w:lang w:val="pt-BR"/>
-              </w:rPr>
-              <w:t>Gravetter</w:t>
-            </w:r>
-            <w:proofErr w:type="spellEnd"/>
-            <w:r>
-              <w:rPr>
-                <w:rFonts w:ascii="Arial" w:hAnsi="Arial" w:cs="Arial"/>
-                <w:sz w:val="20"/>
-                <w:szCs w:val="20"/>
-                <w:lang w:val="pt-BR"/>
-              </w:rPr>
-              <w:t xml:space="preserve"> &amp; </w:t>
-            </w:r>
-            <w:proofErr w:type="spellStart"/>
-            <w:r>
-              <w:rPr>
-                <w:rFonts w:ascii="Arial" w:hAnsi="Arial" w:cs="Arial"/>
-                <w:sz w:val="20"/>
-                <w:szCs w:val="20"/>
-                <w:lang w:val="pt-BR"/>
-              </w:rPr>
-              <w:t>Wallnau</w:t>
-            </w:r>
-            <w:proofErr w:type="spellEnd"/>
-            <w:r>
-              <w:rPr>
-                <w:rFonts w:ascii="Arial" w:hAnsi="Arial" w:cs="Arial"/>
-                <w:sz w:val="20"/>
-                <w:szCs w:val="20"/>
-                <w:lang w:val="pt-BR"/>
-              </w:rPr>
-              <w:t>, capítulo 6 (exceto a seção 6.4)</w:t>
+              <w:t>Gravetter &amp; Wallnau, capítulo 6 (exceto a seção 6.4)</w:t>
             </w:r>
           </w:p>
         </w:tc>
@@ -4748,46 +3983,7 @@
                 <w:lang w:val="pt-BR"/>
               </w:rPr>
               <w:br/>
-            </w:r>
-            <w:proofErr w:type="spellStart"/>
-            <w:r>
-              <w:rPr>
-                <w:rFonts w:ascii="Arial" w:hAnsi="Arial" w:cs="Arial"/>
-                <w:sz w:val="20"/>
-                <w:szCs w:val="20"/>
-                <w:lang w:val="pt-BR"/>
-              </w:rPr>
-              <w:t>Gravetter</w:t>
-            </w:r>
-            <w:proofErr w:type="spellEnd"/>
-            <w:r>
-              <w:rPr>
-                <w:rFonts w:ascii="Arial" w:hAnsi="Arial" w:cs="Arial"/>
-                <w:sz w:val="20"/>
-                <w:szCs w:val="20"/>
-                <w:lang w:val="pt-BR"/>
-              </w:rPr>
-              <w:t xml:space="preserve"> &amp; </w:t>
-            </w:r>
-            <w:proofErr w:type="spellStart"/>
-            <w:r>
-              <w:rPr>
-                <w:rFonts w:ascii="Arial" w:hAnsi="Arial" w:cs="Arial"/>
-                <w:sz w:val="20"/>
-                <w:szCs w:val="20"/>
-                <w:lang w:val="pt-BR"/>
-              </w:rPr>
-              <w:t>Wallnau</w:t>
-            </w:r>
-            <w:proofErr w:type="spellEnd"/>
-            <w:r>
-              <w:rPr>
-                <w:rFonts w:ascii="Arial" w:hAnsi="Arial" w:cs="Arial"/>
-                <w:sz w:val="20"/>
-                <w:szCs w:val="20"/>
-                <w:lang w:val="pt-BR"/>
-              </w:rPr>
-              <w:t>, capítulo 7</w:t>
+              <w:t>Gravetter &amp; Wallnau, capítulo 7</w:t>
             </w:r>
           </w:p>
         </w:tc>
@@ -5331,42 +4527,8 @@
                 <w:sz w:val="20"/>
                 <w:szCs w:val="20"/>
               </w:rPr>
-              <w:t xml:space="preserve">Tema, </w:t>
-            </w:r>
-            <w:proofErr w:type="spellStart"/>
-            <w:r>
-              <w:rPr>
-                <w:rFonts w:ascii="Arial" w:hAnsi="Arial" w:cs="Arial"/>
-                <w:b/>
-                <w:color w:val="FFFFFF"/>
-                <w:sz w:val="20"/>
-                <w:szCs w:val="20"/>
-              </w:rPr>
-              <w:t>atividade</w:t>
-            </w:r>
-            <w:proofErr w:type="spellEnd"/>
-            <w:r>
-              <w:rPr>
-                <w:rFonts w:ascii="Arial" w:hAnsi="Arial" w:cs="Arial"/>
-                <w:b/>
-                <w:color w:val="FFFFFF"/>
-                <w:sz w:val="20"/>
-                <w:szCs w:val="20"/>
-              </w:rPr>
-              <w:t xml:space="preserve"> e </w:t>
-            </w:r>
-            <w:proofErr w:type="spellStart"/>
-            <w:r>
-              <w:rPr>
-                <w:rFonts w:ascii="Arial" w:hAnsi="Arial" w:cs="Arial"/>
-                <w:b/>
-                <w:color w:val="FFFFFF"/>
-                <w:sz w:val="20"/>
-                <w:szCs w:val="20"/>
-              </w:rPr>
-              <w:t>leitura</w:t>
-            </w:r>
-            <w:proofErr w:type="spellEnd"/>
+              <w:t>Tema, atividade e leitura</w:t>
+            </w:r>
           </w:p>
         </w:tc>
       </w:tr>
@@ -5455,46 +4617,7 @@
                 <w:lang w:val="pt-BR"/>
               </w:rPr>
               <w:br/>
-            </w:r>
-            <w:proofErr w:type="spellStart"/>
-            <w:r>
-              <w:rPr>
-                <w:rFonts w:ascii="Arial" w:hAnsi="Arial" w:cs="Arial"/>
-                <w:sz w:val="20"/>
-                <w:szCs w:val="20"/>
-                <w:lang w:val="pt-BR"/>
-              </w:rPr>
-              <w:t>Gravetter</w:t>
-            </w:r>
-            <w:proofErr w:type="spellEnd"/>
-            <w:r>
-              <w:rPr>
-                <w:rFonts w:ascii="Arial" w:hAnsi="Arial" w:cs="Arial"/>
-                <w:sz w:val="20"/>
-                <w:szCs w:val="20"/>
-                <w:lang w:val="pt-BR"/>
-              </w:rPr>
-              <w:t xml:space="preserve"> &amp; </w:t>
-            </w:r>
-            <w:proofErr w:type="spellStart"/>
-            <w:r>
-              <w:rPr>
-                <w:rFonts w:ascii="Arial" w:hAnsi="Arial" w:cs="Arial"/>
-                <w:sz w:val="20"/>
-                <w:szCs w:val="20"/>
-                <w:lang w:val="pt-BR"/>
-              </w:rPr>
-              <w:t>Wallnau</w:t>
-            </w:r>
-            <w:proofErr w:type="spellEnd"/>
-            <w:r>
-              <w:rPr>
-                <w:rFonts w:ascii="Arial" w:hAnsi="Arial" w:cs="Arial"/>
-                <w:sz w:val="20"/>
-                <w:szCs w:val="20"/>
-                <w:lang w:val="pt-BR"/>
-              </w:rPr>
-              <w:t>, capítulo 8</w:t>
+              <w:t>Gravetter &amp; Wallnau, capítulo 8</w:t>
             </w:r>
           </w:p>
         </w:tc>
@@ -5584,46 +4707,7 @@
                 <w:lang w:val="pt-BR"/>
               </w:rPr>
               <w:br/>
-            </w:r>
-            <w:proofErr w:type="spellStart"/>
-            <w:r>
-              <w:rPr>
-                <w:rFonts w:ascii="Arial" w:hAnsi="Arial" w:cs="Arial"/>
-                <w:sz w:val="20"/>
-                <w:szCs w:val="20"/>
-                <w:lang w:val="pt-BR"/>
-              </w:rPr>
-              <w:t>Gravetter</w:t>
-            </w:r>
-            <w:proofErr w:type="spellEnd"/>
-            <w:r>
-              <w:rPr>
-                <w:rFonts w:ascii="Arial" w:hAnsi="Arial" w:cs="Arial"/>
-                <w:sz w:val="20"/>
-                <w:szCs w:val="20"/>
-                <w:lang w:val="pt-BR"/>
-              </w:rPr>
-              <w:t xml:space="preserve"> &amp; </w:t>
-            </w:r>
-            <w:proofErr w:type="spellStart"/>
-            <w:r>
-              <w:rPr>
-                <w:rFonts w:ascii="Arial" w:hAnsi="Arial" w:cs="Arial"/>
-                <w:sz w:val="20"/>
-                <w:szCs w:val="20"/>
-                <w:lang w:val="pt-BR"/>
-              </w:rPr>
-              <w:t>Wallnau</w:t>
-            </w:r>
-            <w:proofErr w:type="spellEnd"/>
-            <w:r>
-              <w:rPr>
-                <w:rFonts w:ascii="Arial" w:hAnsi="Arial" w:cs="Arial"/>
-                <w:sz w:val="20"/>
-                <w:szCs w:val="20"/>
-                <w:lang w:val="pt-BR"/>
-              </w:rPr>
-              <w:t>, capítulo 9</w:t>
+              <w:t>Gravetter &amp; Wallnau, capítulo 9</w:t>
             </w:r>
           </w:p>
         </w:tc>
@@ -5713,46 +4797,7 @@
                 <w:lang w:val="pt-BR"/>
               </w:rPr>
               <w:br/>
-            </w:r>
-            <w:proofErr w:type="spellStart"/>
-            <w:r>
-              <w:rPr>
-                <w:rFonts w:ascii="Arial" w:hAnsi="Arial" w:cs="Arial"/>
-                <w:sz w:val="20"/>
-                <w:szCs w:val="20"/>
-                <w:lang w:val="pt-BR"/>
-              </w:rPr>
-              <w:t>Gravetter</w:t>
-            </w:r>
-            <w:proofErr w:type="spellEnd"/>
-            <w:r>
-              <w:rPr>
-                <w:rFonts w:ascii="Arial" w:hAnsi="Arial" w:cs="Arial"/>
-                <w:sz w:val="20"/>
-                <w:szCs w:val="20"/>
-                <w:lang w:val="pt-BR"/>
-              </w:rPr>
-              <w:t xml:space="preserve"> &amp; </w:t>
-            </w:r>
-            <w:proofErr w:type="spellStart"/>
-            <w:r>
-              <w:rPr>
-                <w:rFonts w:ascii="Arial" w:hAnsi="Arial" w:cs="Arial"/>
-                <w:sz w:val="20"/>
-                <w:szCs w:val="20"/>
-                <w:lang w:val="pt-BR"/>
-              </w:rPr>
-              <w:t>Wallnau</w:t>
-            </w:r>
-            <w:proofErr w:type="spellEnd"/>
-            <w:r>
-              <w:rPr>
-                <w:rFonts w:ascii="Arial" w:hAnsi="Arial" w:cs="Arial"/>
-                <w:sz w:val="20"/>
-                <w:szCs w:val="20"/>
-                <w:lang w:val="pt-BR"/>
-              </w:rPr>
-              <w:t>, capítulo 10 (exceto as páginas 314–315)</w:t>
+              <w:t>Gravetter &amp; Wallnau, capítulo 10 (exceto as páginas 314–315)</w:t>
             </w:r>
           </w:p>
         </w:tc>
@@ -5842,46 +4887,7 @@
                 <w:lang w:val="pt-BR"/>
               </w:rPr>
               <w:br/>
-            </w:r>
-            <w:proofErr w:type="spellStart"/>
-            <w:r>
-              <w:rPr>
-                <w:rFonts w:ascii="Arial" w:hAnsi="Arial" w:cs="Arial"/>
-                <w:sz w:val="20"/>
-                <w:szCs w:val="20"/>
-                <w:lang w:val="pt-BR"/>
-              </w:rPr>
-              <w:t>Gravetter</w:t>
-            </w:r>
-            <w:proofErr w:type="spellEnd"/>
-            <w:r>
-              <w:rPr>
-                <w:rFonts w:ascii="Arial" w:hAnsi="Arial" w:cs="Arial"/>
-                <w:sz w:val="20"/>
-                <w:szCs w:val="20"/>
-                <w:lang w:val="pt-BR"/>
-              </w:rPr>
-              <w:t xml:space="preserve"> &amp; </w:t>
-            </w:r>
-            <w:proofErr w:type="spellStart"/>
-            <w:r>
-              <w:rPr>
-                <w:rFonts w:ascii="Arial" w:hAnsi="Arial" w:cs="Arial"/>
-                <w:sz w:val="20"/>
-                <w:szCs w:val="20"/>
-                <w:lang w:val="pt-BR"/>
-              </w:rPr>
-              <w:t>Wallnau</w:t>
-            </w:r>
-            <w:proofErr w:type="spellEnd"/>
-            <w:r>
-              <w:rPr>
-                <w:rFonts w:ascii="Arial" w:hAnsi="Arial" w:cs="Arial"/>
-                <w:sz w:val="20"/>
-                <w:szCs w:val="20"/>
-                <w:lang w:val="pt-BR"/>
-              </w:rPr>
-              <w:t>, capítulo 10 (exceto as páginas 314–315)</w:t>
+              <w:t>Gravetter &amp; Wallnau, capítulo 10 (exceto as páginas 314–315)</w:t>
             </w:r>
           </w:p>
         </w:tc>
@@ -5971,46 +4977,7 @@
                 <w:lang w:val="pt-BR"/>
               </w:rPr>
               <w:br/>
-            </w:r>
-            <w:proofErr w:type="spellStart"/>
-            <w:r>
-              <w:rPr>
-                <w:rFonts w:ascii="Arial" w:hAnsi="Arial" w:cs="Arial"/>
-                <w:sz w:val="20"/>
-                <w:szCs w:val="20"/>
-                <w:lang w:val="pt-BR"/>
-              </w:rPr>
-              <w:t>Gravetter</w:t>
-            </w:r>
-            <w:proofErr w:type="spellEnd"/>
-            <w:r>
-              <w:rPr>
-                <w:rFonts w:ascii="Arial" w:hAnsi="Arial" w:cs="Arial"/>
-                <w:sz w:val="20"/>
-                <w:szCs w:val="20"/>
-                <w:lang w:val="pt-BR"/>
-              </w:rPr>
-              <w:t xml:space="preserve"> &amp; </w:t>
-            </w:r>
-            <w:proofErr w:type="spellStart"/>
-            <w:r>
-              <w:rPr>
-                <w:rFonts w:ascii="Arial" w:hAnsi="Arial" w:cs="Arial"/>
-                <w:sz w:val="20"/>
-                <w:szCs w:val="20"/>
-                <w:lang w:val="pt-BR"/>
-              </w:rPr>
-              <w:t>Wallnau</w:t>
-            </w:r>
-            <w:proofErr w:type="spellEnd"/>
-            <w:r>
-              <w:rPr>
-                <w:rFonts w:ascii="Arial" w:hAnsi="Arial" w:cs="Arial"/>
-                <w:sz w:val="20"/>
-                <w:szCs w:val="20"/>
-                <w:lang w:val="pt-BR"/>
-              </w:rPr>
-              <w:t>, capítulo 11</w:t>
+              <w:t>Gravetter &amp; Wallnau, capítulo 11</w:t>
             </w:r>
           </w:p>
         </w:tc>
@@ -6069,12 +5036,77 @@
               <w:spacing w:after="0" w:line="252" w:lineRule="auto"/>
               <w:rPr>
                 <w:rFonts w:ascii="Arial" w:hAnsi="Arial" w:cs="Arial"/>
+                <w:bCs/>
+                <w:sz w:val="20"/>
+                <w:szCs w:val="20"/>
+                <w:lang w:val="pt-BR"/>
+              </w:rPr>
+            </w:pPr>
+            <w:r>
+              <w:rPr>
+                <w:rFonts w:ascii="Arial" w:hAnsi="Arial" w:cs="Arial"/>
                 <w:b/>
                 <w:sz w:val="20"/>
                 <w:szCs w:val="20"/>
                 <w:lang w:val="pt-BR"/>
               </w:rPr>
+              <w:t xml:space="preserve">Atividade assíncrona: </w:t>
+            </w:r>
+            <w:r>
+              <w:rPr>
+                <w:rFonts w:ascii="Arial" w:hAnsi="Arial" w:cs="Arial"/>
+                <w:bCs/>
+                <w:sz w:val="20"/>
+                <w:szCs w:val="20"/>
+                <w:lang w:val="pt-BR"/>
+              </w:rPr>
+              <w:t>AmericasBarometer</w:t>
+            </w:r>
+            <w:r>
+              <w:rPr>
+                <w:rFonts w:ascii="Arial" w:hAnsi="Arial" w:cs="Arial"/>
+                <w:bCs/>
+                <w:sz w:val="20"/>
+                <w:szCs w:val="20"/>
+                <w:lang w:val="pt-BR"/>
+              </w:rPr>
+              <w:t xml:space="preserve"> 2026</w:t>
+            </w:r>
+            <w:r>
+              <w:rPr>
+                <w:rFonts w:ascii="Arial" w:hAnsi="Arial" w:cs="Arial"/>
+                <w:bCs/>
+                <w:sz w:val="20"/>
+                <w:szCs w:val="20"/>
+                <w:lang w:val="pt-BR"/>
+              </w:rPr>
+              <w:t xml:space="preserve"> (USP)</w:t>
+            </w:r>
+          </w:p>
+          <w:p>
+            <w:pPr>
+              <w:spacing w:after="0" w:line="252" w:lineRule="auto"/>
+              <w:rPr>
+                <w:rFonts w:ascii="Arial" w:hAnsi="Arial" w:cs="Arial"/>
+                <w:b/>
+                <w:sz w:val="20"/>
+                <w:szCs w:val="20"/>
+                <w:lang w:val="pt-BR"/>
+              </w:rPr>
             </w:pPr>
+            <w:hyperlink r:id="rId16" w:history="1">
+              <w:r>
+                <w:rPr>
+                  <w:rStyle w:val="Hyperlink"/>
+                  <w:rFonts w:ascii="Arial" w:hAnsi="Arial" w:cs="Arial"/>
+                  <w:b/>
+                  <w:sz w:val="20"/>
+                  <w:szCs w:val="20"/>
+                  <w:lang w:val="pt-BR"/>
+                </w:rPr>
+                <w:t>https://www.youtube.com/live/PSfw6ewSzvE</w:t>
+              </w:r>
+            </w:hyperlink>
             <w:r>
               <w:rPr>
                 <w:rFonts w:ascii="Arial" w:hAnsi="Arial" w:cs="Arial"/>
@@ -6083,37 +5115,7 @@
                 <w:szCs w:val="20"/>
                 <w:lang w:val="pt-BR"/>
               </w:rPr>
-              <w:t xml:space="preserve">Atividade assíncrona: </w:t>
-            </w:r>
-            <w:r>
-              <w:rPr>
-                <w:rFonts w:ascii="Arial" w:hAnsi="Arial" w:cs="Arial"/>
-                <w:bCs/>
-                <w:sz w:val="20"/>
-                <w:szCs w:val="20"/>
-                <w:lang w:val="pt-BR"/>
-              </w:rPr>
-              <w:t>AmericasBarometer</w:t>
-            </w:r>
-            <w:r>
-              <w:rPr>
-                <w:rFonts w:ascii="Arial" w:hAnsi="Arial" w:cs="Arial"/>
-                <w:bCs/>
-                <w:sz w:val="20"/>
-                <w:szCs w:val="20"/>
-                <w:lang w:val="pt-BR"/>
-              </w:rPr>
-              <w:t xml:space="preserve"> 2026</w:t>
-            </w:r>
-            <w:r>
-              <w:rPr>
-                <w:rFonts w:ascii="Arial" w:hAnsi="Arial" w:cs="Arial"/>
-                <w:bCs/>
-                <w:sz w:val="20"/>
-                <w:szCs w:val="20"/>
-                <w:lang w:val="pt-BR"/>
-              </w:rPr>
-              <w:t xml:space="preserve"> (USP)</w:t>
+              <w:t xml:space="preserve"> </w:t>
             </w:r>
           </w:p>
         </w:tc>
@@ -6309,7 +5311,6 @@
                 <w:lang w:val="pt-BR"/>
               </w:rPr>
             </w:pPr>
-            <w:proofErr w:type="spellStart"/>
             <w:r>
               <w:rPr>
                 <w:rFonts w:ascii="Arial" w:hAnsi="Arial" w:cs="Arial"/>
@@ -6319,43 +5320,7 @@
                 <w:sz w:val="20"/>
                 <w:szCs w:val="20"/>
               </w:rPr>
-              <w:t>Prova</w:t>
-            </w:r>
-            <w:proofErr w:type="spellEnd"/>
-            <w:r>
-              <w:rPr>
-                <w:rFonts w:ascii="Arial" w:hAnsi="Arial" w:cs="Arial"/>
-                <w:b/>
-                <w:bCs/>
-                <w:color w:val="00B050"/>
-                <w:sz w:val="20"/>
-                <w:szCs w:val="20"/>
-              </w:rPr>
-              <w:t xml:space="preserve"> da </w:t>
-            </w:r>
-            <w:proofErr w:type="spellStart"/>
-            <w:r>
-              <w:rPr>
-                <w:rFonts w:ascii="Arial" w:hAnsi="Arial" w:cs="Arial"/>
-                <w:b/>
-                <w:bCs/>
-                <w:color w:val="00B050"/>
-                <w:sz w:val="20"/>
-                <w:szCs w:val="20"/>
-              </w:rPr>
-              <w:t>Unidade</w:t>
-            </w:r>
-            <w:proofErr w:type="spellEnd"/>
-            <w:r>
-              <w:rPr>
-                <w:rFonts w:ascii="Arial" w:hAnsi="Arial" w:cs="Arial"/>
-                <w:b/>
-                <w:bCs/>
-                <w:color w:val="00B050"/>
-                <w:sz w:val="20"/>
-                <w:szCs w:val="20"/>
-              </w:rPr>
-              <w:t xml:space="preserve"> 3</w:t>
+              <w:t>Prova da Unidade 3</w:t>
             </w:r>
           </w:p>
         </w:tc>
@@ -6522,42 +5487,8 @@
                 <w:sz w:val="20"/>
                 <w:szCs w:val="20"/>
               </w:rPr>
-              <w:t xml:space="preserve">Tema, </w:t>
-            </w:r>
-            <w:proofErr w:type="spellStart"/>
-            <w:r>
-              <w:rPr>
-                <w:rFonts w:ascii="Arial" w:hAnsi="Arial" w:cs="Arial"/>
-                <w:b/>
-                <w:color w:val="FFFFFF"/>
-                <w:sz w:val="20"/>
-                <w:szCs w:val="20"/>
-              </w:rPr>
-              <w:t>atividade</w:t>
-            </w:r>
-            <w:proofErr w:type="spellEnd"/>
-            <w:r>
-              <w:rPr>
-                <w:rFonts w:ascii="Arial" w:hAnsi="Arial" w:cs="Arial"/>
-                <w:b/>
-                <w:color w:val="FFFFFF"/>
-                <w:sz w:val="20"/>
-                <w:szCs w:val="20"/>
-              </w:rPr>
-              <w:t xml:space="preserve"> e </w:t>
-            </w:r>
-            <w:proofErr w:type="spellStart"/>
-            <w:r>
-              <w:rPr>
-                <w:rFonts w:ascii="Arial" w:hAnsi="Arial" w:cs="Arial"/>
-                <w:b/>
-                <w:color w:val="FFFFFF"/>
-                <w:sz w:val="20"/>
-                <w:szCs w:val="20"/>
-              </w:rPr>
-              <w:t>leitura</w:t>
-            </w:r>
-            <w:proofErr w:type="spellEnd"/>
+              <w:t>Tema, atividade e leitura</w:t>
+            </w:r>
           </w:p>
         </w:tc>
       </w:tr>
@@ -6648,46 +5579,7 @@
                 <w:lang w:val="pt-BR"/>
               </w:rPr>
               <w:br/>
-            </w:r>
-            <w:proofErr w:type="spellStart"/>
-            <w:r>
-              <w:rPr>
-                <w:rFonts w:ascii="Arial" w:hAnsi="Arial" w:cs="Arial"/>
-                <w:sz w:val="20"/>
-                <w:szCs w:val="20"/>
-                <w:lang w:val="pt-BR"/>
-              </w:rPr>
-              <w:t>Gravetter</w:t>
-            </w:r>
-            <w:proofErr w:type="spellEnd"/>
-            <w:r>
-              <w:rPr>
-                <w:rFonts w:ascii="Arial" w:hAnsi="Arial" w:cs="Arial"/>
-                <w:sz w:val="20"/>
-                <w:szCs w:val="20"/>
-                <w:lang w:val="pt-BR"/>
-              </w:rPr>
-              <w:t xml:space="preserve"> &amp; </w:t>
-            </w:r>
-            <w:proofErr w:type="spellStart"/>
-            <w:r>
-              <w:rPr>
-                <w:rFonts w:ascii="Arial" w:hAnsi="Arial" w:cs="Arial"/>
-                <w:sz w:val="20"/>
-                <w:szCs w:val="20"/>
-                <w:lang w:val="pt-BR"/>
-              </w:rPr>
-              <w:t>Wallnau</w:t>
-            </w:r>
-            <w:proofErr w:type="spellEnd"/>
-            <w:r>
-              <w:rPr>
-                <w:rFonts w:ascii="Arial" w:hAnsi="Arial" w:cs="Arial"/>
-                <w:sz w:val="20"/>
-                <w:szCs w:val="20"/>
-                <w:lang w:val="pt-BR"/>
-              </w:rPr>
-              <w:t>, capítulo 15 (exceto a seção 15.5)</w:t>
+              <w:t>Gravetter &amp; Wallnau, capítulo 15 (exceto a seção 15.5)</w:t>
             </w:r>
           </w:p>
         </w:tc>
@@ -6779,46 +5671,7 @@
                 <w:lang w:val="pt-BR"/>
               </w:rPr>
               <w:br/>
-            </w:r>
-            <w:proofErr w:type="spellStart"/>
-            <w:r>
-              <w:rPr>
-                <w:rFonts w:ascii="Arial" w:hAnsi="Arial" w:cs="Arial"/>
-                <w:sz w:val="20"/>
-                <w:szCs w:val="20"/>
-                <w:lang w:val="pt-BR"/>
-              </w:rPr>
-              <w:t>Gravetter</w:t>
-            </w:r>
-            <w:proofErr w:type="spellEnd"/>
-            <w:r>
-              <w:rPr>
-                <w:rFonts w:ascii="Arial" w:hAnsi="Arial" w:cs="Arial"/>
-                <w:sz w:val="20"/>
-                <w:szCs w:val="20"/>
-                <w:lang w:val="pt-BR"/>
-              </w:rPr>
-              <w:t xml:space="preserve"> &amp; </w:t>
-            </w:r>
-            <w:proofErr w:type="spellStart"/>
-            <w:r>
-              <w:rPr>
-                <w:rFonts w:ascii="Arial" w:hAnsi="Arial" w:cs="Arial"/>
-                <w:sz w:val="20"/>
-                <w:szCs w:val="20"/>
-                <w:lang w:val="pt-BR"/>
-              </w:rPr>
-              <w:t>Wallnau</w:t>
-            </w:r>
-            <w:proofErr w:type="spellEnd"/>
-            <w:r>
-              <w:rPr>
-                <w:rFonts w:ascii="Arial" w:hAnsi="Arial" w:cs="Arial"/>
-                <w:sz w:val="20"/>
-                <w:szCs w:val="20"/>
-                <w:lang w:val="pt-BR"/>
-              </w:rPr>
-              <w:t>, capítulo 15 (exceto a seção 15.5)</w:t>
+              <w:t>Gravetter &amp; Wallnau, capítulo 15 (exceto a seção 15.5)</w:t>
             </w:r>
           </w:p>
         </w:tc>
@@ -6910,46 +5763,7 @@
                 <w:lang w:val="pt-BR"/>
               </w:rPr>
               <w:br/>
-            </w:r>
-            <w:proofErr w:type="spellStart"/>
-            <w:r>
-              <w:rPr>
-                <w:rFonts w:ascii="Arial" w:hAnsi="Arial" w:cs="Arial"/>
-                <w:sz w:val="20"/>
-                <w:szCs w:val="20"/>
-                <w:lang w:val="pt-BR"/>
-              </w:rPr>
-              <w:t>Gravetter</w:t>
-            </w:r>
-            <w:proofErr w:type="spellEnd"/>
-            <w:r>
-              <w:rPr>
-                <w:rFonts w:ascii="Arial" w:hAnsi="Arial" w:cs="Arial"/>
-                <w:sz w:val="20"/>
-                <w:szCs w:val="20"/>
-                <w:lang w:val="pt-BR"/>
-              </w:rPr>
-              <w:t xml:space="preserve"> &amp; </w:t>
-            </w:r>
-            <w:proofErr w:type="spellStart"/>
-            <w:r>
-              <w:rPr>
-                <w:rFonts w:ascii="Arial" w:hAnsi="Arial" w:cs="Arial"/>
-                <w:sz w:val="20"/>
-                <w:szCs w:val="20"/>
-                <w:lang w:val="pt-BR"/>
-              </w:rPr>
-              <w:t>Wallnau</w:t>
-            </w:r>
-            <w:proofErr w:type="spellEnd"/>
-            <w:r>
-              <w:rPr>
-                <w:rFonts w:ascii="Arial" w:hAnsi="Arial" w:cs="Arial"/>
-                <w:sz w:val="20"/>
-                <w:szCs w:val="20"/>
-                <w:lang w:val="pt-BR"/>
-              </w:rPr>
-              <w:t>, capítulo 16, somente páginas 529–537, 544–545 e 551–552</w:t>
+              <w:t>Gravetter &amp; Wallnau, capítulo 16, somente páginas 529–537, 544–545 e 551–552</w:t>
             </w:r>
           </w:p>
         </w:tc>
@@ -7041,46 +5855,7 @@
                 <w:lang w:val="pt-BR"/>
               </w:rPr>
               <w:br/>
-            </w:r>
-            <w:proofErr w:type="spellStart"/>
-            <w:r>
-              <w:rPr>
-                <w:rFonts w:ascii="Arial" w:hAnsi="Arial" w:cs="Arial"/>
-                <w:sz w:val="20"/>
-                <w:szCs w:val="20"/>
-                <w:lang w:val="pt-BR"/>
-              </w:rPr>
-              <w:t>Gravetter</w:t>
-            </w:r>
-            <w:proofErr w:type="spellEnd"/>
-            <w:r>
-              <w:rPr>
-                <w:rFonts w:ascii="Arial" w:hAnsi="Arial" w:cs="Arial"/>
-                <w:sz w:val="20"/>
-                <w:szCs w:val="20"/>
-                <w:lang w:val="pt-BR"/>
-              </w:rPr>
-              <w:t xml:space="preserve"> &amp; </w:t>
-            </w:r>
-            <w:proofErr w:type="spellStart"/>
-            <w:r>
-              <w:rPr>
-                <w:rFonts w:ascii="Arial" w:hAnsi="Arial" w:cs="Arial"/>
-                <w:sz w:val="20"/>
-                <w:szCs w:val="20"/>
-                <w:lang w:val="pt-BR"/>
-              </w:rPr>
-              <w:t>Wallnau</w:t>
-            </w:r>
-            <w:proofErr w:type="spellEnd"/>
-            <w:r>
-              <w:rPr>
-                <w:rFonts w:ascii="Arial" w:hAnsi="Arial" w:cs="Arial"/>
-                <w:sz w:val="20"/>
-                <w:szCs w:val="20"/>
-                <w:lang w:val="pt-BR"/>
-              </w:rPr>
-              <w:t>, capítulo 16, somente páginas 529–537, 544–545 e 551–552</w:t>
+              <w:t>Gravetter &amp; Wallnau, capítulo 16, somente páginas 529–537, 544–545 e 551–552</w:t>
             </w:r>
           </w:p>
         </w:tc>
@@ -7170,46 +5945,7 @@
                 <w:lang w:val="pt-BR"/>
               </w:rPr>
               <w:br/>
-            </w:r>
-            <w:proofErr w:type="spellStart"/>
-            <w:r>
-              <w:rPr>
-                <w:rFonts w:ascii="Arial" w:hAnsi="Arial" w:cs="Arial"/>
-                <w:sz w:val="20"/>
-                <w:szCs w:val="20"/>
-                <w:lang w:val="pt-BR"/>
-              </w:rPr>
-              <w:t>Gravetter</w:t>
-            </w:r>
-            <w:proofErr w:type="spellEnd"/>
-            <w:r>
-              <w:rPr>
-                <w:rFonts w:ascii="Arial" w:hAnsi="Arial" w:cs="Arial"/>
-                <w:sz w:val="20"/>
-                <w:szCs w:val="20"/>
-                <w:lang w:val="pt-BR"/>
-              </w:rPr>
-              <w:t xml:space="preserve"> &amp; </w:t>
-            </w:r>
-            <w:proofErr w:type="spellStart"/>
-            <w:r>
-              <w:rPr>
-                <w:rFonts w:ascii="Arial" w:hAnsi="Arial" w:cs="Arial"/>
-                <w:sz w:val="20"/>
-                <w:szCs w:val="20"/>
-                <w:lang w:val="pt-BR"/>
-              </w:rPr>
-              <w:t>Wallnau</w:t>
-            </w:r>
-            <w:proofErr w:type="spellEnd"/>
-            <w:r>
-              <w:rPr>
-                <w:rFonts w:ascii="Arial" w:hAnsi="Arial" w:cs="Arial"/>
-                <w:sz w:val="20"/>
-                <w:szCs w:val="20"/>
-                <w:lang w:val="pt-BR"/>
-              </w:rPr>
-              <w:t>, capítulo 16, somente páginas 529–537, 544–545 e 551–552</w:t>
+              <w:t>Gravetter &amp; Wallnau, capítulo 16, somente páginas 529–537, 544–545 e 551–552</w:t>
             </w:r>
           </w:p>
         </w:tc>
@@ -7247,6 +5983,7 @@
                 <w:sz w:val="20"/>
                 <w:szCs w:val="20"/>
               </w:rPr>
+              <w:lastRenderedPageBreak/>
               <w:t>19/11 – Aula 2</w:t>
             </w:r>
             <w:r>
@@ -7329,7 +6066,6 @@
                 <w:szCs w:val="20"/>
                 <w:lang w:val="pt-BR"/>
               </w:rPr>
-              <w:lastRenderedPageBreak/>
               <w:t>24/11</w:t>
             </w:r>
             <w:r>
@@ -7512,7 +6248,6 @@
                 <w:lang w:val="pt-BR"/>
               </w:rPr>
             </w:pPr>
-            <w:proofErr w:type="spellStart"/>
             <w:r>
               <w:rPr>
                 <w:rFonts w:ascii="Arial" w:hAnsi="Arial" w:cs="Arial"/>
@@ -7522,43 +6257,7 @@
                 <w:sz w:val="20"/>
                 <w:szCs w:val="20"/>
               </w:rPr>
-              <w:t>Prova</w:t>
-            </w:r>
-            <w:proofErr w:type="spellEnd"/>
-            <w:r>
-              <w:rPr>
-                <w:rFonts w:ascii="Arial" w:hAnsi="Arial" w:cs="Arial"/>
-                <w:b/>
-                <w:bCs/>
-                <w:color w:val="00B050"/>
-                <w:sz w:val="20"/>
-                <w:szCs w:val="20"/>
-              </w:rPr>
-              <w:t xml:space="preserve"> da </w:t>
-            </w:r>
-            <w:proofErr w:type="spellStart"/>
-            <w:r>
-              <w:rPr>
-                <w:rFonts w:ascii="Arial" w:hAnsi="Arial" w:cs="Arial"/>
-                <w:b/>
-                <w:bCs/>
-                <w:color w:val="00B050"/>
-                <w:sz w:val="20"/>
-                <w:szCs w:val="20"/>
-              </w:rPr>
-              <w:t>Unidade</w:t>
-            </w:r>
-            <w:proofErr w:type="spellEnd"/>
-            <w:r>
-              <w:rPr>
-                <w:rFonts w:ascii="Arial" w:hAnsi="Arial" w:cs="Arial"/>
-                <w:b/>
-                <w:bCs/>
-                <w:color w:val="00B050"/>
-                <w:sz w:val="20"/>
-                <w:szCs w:val="20"/>
-              </w:rPr>
-              <w:t xml:space="preserve"> </w:t>
+              <w:t xml:space="preserve">Prova da Unidade </w:t>
             </w:r>
             <w:r>
               <w:rPr>
@@ -7712,7 +6411,6 @@
                 <w:lang w:val="pt-BR"/>
               </w:rPr>
             </w:pPr>
-            <w:proofErr w:type="spellStart"/>
             <w:r>
               <w:rPr>
                 <w:rFonts w:ascii="Arial" w:hAnsi="Arial" w:cs="Arial"/>
@@ -7722,19 +6420,7 @@
                 <w:sz w:val="20"/>
                 <w:szCs w:val="20"/>
               </w:rPr>
-              <w:t>Prova</w:t>
-            </w:r>
-            <w:proofErr w:type="spellEnd"/>
-            <w:r>
-              <w:rPr>
-                <w:rFonts w:ascii="Arial" w:hAnsi="Arial" w:cs="Arial"/>
-                <w:b/>
-                <w:bCs/>
-                <w:color w:val="00B050"/>
-                <w:sz w:val="20"/>
-                <w:szCs w:val="20"/>
-              </w:rPr>
-              <w:t xml:space="preserve"> final</w:t>
+              <w:t>Prova final</w:t>
             </w:r>
           </w:p>
         </w:tc>
@@ -7844,8 +6530,8 @@
       </w:pPr>
     </w:p>
     <w:sectPr>
-      <w:headerReference w:type="default" r:id="rId16"/>
-      <w:footerReference w:type="default" r:id="rId17"/>
+      <w:headerReference w:type="default" r:id="rId17"/>
+      <w:footerReference w:type="default" r:id="rId18"/>
       <w:pgSz w:w="12240" w:h="15840"/>
       <w:pgMar w:top="1152" w:right="1224" w:bottom="1152" w:left="1224" w:header="504" w:footer="504" w:gutter="0"/>
       <w:cols w:space="720"/>

</xml_diff>

<commit_message>
upload notas e presenças
</commit_message>
<xml_diff>
--- a/Ementa_MQAPP_2026.2.docx
+++ b/Ementa_MQAPP_2026.2.docx
@@ -49,7 +49,6 @@
                 <w:szCs w:val="20"/>
               </w:rPr>
             </w:pPr>
-            <w:proofErr w:type="spellStart"/>
             <w:r>
               <w:rPr>
                 <w:rFonts w:ascii="Arial" w:hAnsi="Arial" w:cs="Arial"/>
@@ -58,18 +57,7 @@
                 <w:sz w:val="20"/>
                 <w:szCs w:val="20"/>
               </w:rPr>
-              <w:t>Horário</w:t>
-            </w:r>
-            <w:proofErr w:type="spellEnd"/>
-            <w:r>
-              <w:rPr>
-                <w:rFonts w:ascii="Arial" w:hAnsi="Arial" w:cs="Arial"/>
-                <w:b/>
-                <w:color w:val="17384D"/>
-                <w:sz w:val="20"/>
-                <w:szCs w:val="20"/>
-              </w:rPr>
-              <w:t xml:space="preserve"> e local</w:t>
+              <w:t>Horário e local</w:t>
             </w:r>
           </w:p>
         </w:tc>
@@ -147,7 +135,6 @@
                 <w:szCs w:val="20"/>
               </w:rPr>
             </w:pPr>
-            <w:proofErr w:type="spellStart"/>
             <w:r>
               <w:rPr>
                 <w:rFonts w:ascii="Arial" w:hAnsi="Arial" w:cs="Arial"/>
@@ -158,7 +145,6 @@
               </w:rPr>
               <w:t>Docente</w:t>
             </w:r>
-            <w:proofErr w:type="spellEnd"/>
           </w:p>
         </w:tc>
         <w:tc>
@@ -324,7 +310,6 @@
                 <w:szCs w:val="20"/>
               </w:rPr>
             </w:pPr>
-            <w:proofErr w:type="spellStart"/>
             <w:r>
               <w:rPr>
                 <w:rFonts w:ascii="Arial" w:hAnsi="Arial" w:cs="Arial"/>
@@ -343,31 +328,8 @@
                 <w:sz w:val="20"/>
                 <w:szCs w:val="20"/>
               </w:rPr>
-              <w:t>ais</w:t>
-            </w:r>
-            <w:proofErr w:type="spellEnd"/>
-            <w:r>
-              <w:rPr>
-                <w:rFonts w:ascii="Arial" w:hAnsi="Arial" w:cs="Arial"/>
-                <w:b/>
-                <w:color w:val="17384D"/>
-                <w:sz w:val="20"/>
-                <w:szCs w:val="20"/>
-              </w:rPr>
-              <w:t xml:space="preserve"> do </w:t>
-            </w:r>
-            <w:proofErr w:type="spellStart"/>
-            <w:r>
-              <w:rPr>
-                <w:rFonts w:ascii="Arial" w:hAnsi="Arial" w:cs="Arial"/>
-                <w:b/>
-                <w:color w:val="17384D"/>
-                <w:sz w:val="20"/>
-                <w:szCs w:val="20"/>
-              </w:rPr>
-              <w:t>curso</w:t>
-            </w:r>
-            <w:proofErr w:type="spellEnd"/>
+              <w:t>ais do curso</w:t>
+            </w:r>
           </w:p>
         </w:tc>
         <w:tc>
@@ -435,7 +397,6 @@
                 <w:szCs w:val="20"/>
               </w:rPr>
             </w:pPr>
-            <w:proofErr w:type="spellStart"/>
             <w:r>
               <w:rPr>
                 <w:rFonts w:ascii="Arial" w:hAnsi="Arial" w:cs="Arial"/>
@@ -444,31 +405,8 @@
                 <w:sz w:val="20"/>
                 <w:szCs w:val="20"/>
               </w:rPr>
-              <w:t>Horário</w:t>
-            </w:r>
-            <w:proofErr w:type="spellEnd"/>
-            <w:r>
-              <w:rPr>
-                <w:rFonts w:ascii="Arial" w:hAnsi="Arial" w:cs="Arial"/>
-                <w:b/>
-                <w:color w:val="17384D"/>
-                <w:sz w:val="20"/>
-                <w:szCs w:val="20"/>
-              </w:rPr>
-              <w:t xml:space="preserve"> de </w:t>
-            </w:r>
-            <w:proofErr w:type="spellStart"/>
-            <w:r>
-              <w:rPr>
-                <w:rFonts w:ascii="Arial" w:hAnsi="Arial" w:cs="Arial"/>
-                <w:b/>
-                <w:color w:val="17384D"/>
-                <w:sz w:val="20"/>
-                <w:szCs w:val="20"/>
-              </w:rPr>
-              <w:t>atendimento</w:t>
-            </w:r>
-            <w:proofErr w:type="spellEnd"/>
+              <w:t>Horário de atendimento</w:t>
+            </w:r>
           </w:p>
         </w:tc>
         <w:tc>
@@ -819,34 +757,14 @@
           <w:szCs w:val="20"/>
         </w:rPr>
       </w:pPr>
-      <w:proofErr w:type="spellStart"/>
       <w:r>
         <w:rPr>
           <w:rFonts w:ascii="Arial" w:hAnsi="Arial" w:cs="Arial"/>
           <w:sz w:val="20"/>
           <w:szCs w:val="20"/>
         </w:rPr>
-        <w:t>Introdução</w:t>
+        <w:t>Introdução à estatística</w:t>
       </w:r>
-      <w:proofErr w:type="spellEnd"/>
-      <w:r>
-        <w:rPr>
-          <w:rFonts w:ascii="Arial" w:hAnsi="Arial" w:cs="Arial"/>
-          <w:sz w:val="20"/>
-          <w:szCs w:val="20"/>
-        </w:rPr>
-        <w:t xml:space="preserve"> à </w:t>
-      </w:r>
-      <w:proofErr w:type="spellStart"/>
-      <w:r>
-        <w:rPr>
-          <w:rFonts w:ascii="Arial" w:hAnsi="Arial" w:cs="Arial"/>
-          <w:sz w:val="20"/>
-          <w:szCs w:val="20"/>
-        </w:rPr>
-        <w:t>estatística</w:t>
-      </w:r>
-      <w:proofErr w:type="spellEnd"/>
     </w:p>
     <w:p>
       <w:pPr>
@@ -859,7 +777,6 @@
           <w:szCs w:val="20"/>
         </w:rPr>
       </w:pPr>
-      <w:proofErr w:type="spellStart"/>
       <w:r>
         <w:rPr>
           <w:rFonts w:ascii="Arial" w:hAnsi="Arial" w:cs="Arial"/>
@@ -868,7 +785,6 @@
         </w:rPr>
         <w:t>Probabilidade</w:t>
       </w:r>
-      <w:proofErr w:type="spellEnd"/>
     </w:p>
     <w:p>
       <w:pPr>
@@ -903,34 +819,14 @@
           <w:szCs w:val="20"/>
         </w:rPr>
       </w:pPr>
-      <w:proofErr w:type="spellStart"/>
       <w:r>
         <w:rPr>
           <w:rFonts w:ascii="Arial" w:hAnsi="Arial" w:cs="Arial"/>
           <w:sz w:val="20"/>
           <w:szCs w:val="20"/>
         </w:rPr>
-        <w:t>Correlação</w:t>
+        <w:t>Correlação e regressão</w:t>
       </w:r>
-      <w:proofErr w:type="spellEnd"/>
-      <w:r>
-        <w:rPr>
-          <w:rFonts w:ascii="Arial" w:hAnsi="Arial" w:cs="Arial"/>
-          <w:sz w:val="20"/>
-          <w:szCs w:val="20"/>
-        </w:rPr>
-        <w:t xml:space="preserve"> e </w:t>
-      </w:r>
-      <w:proofErr w:type="spellStart"/>
-      <w:r>
-        <w:rPr>
-          <w:rFonts w:ascii="Arial" w:hAnsi="Arial" w:cs="Arial"/>
-          <w:sz w:val="20"/>
-          <w:szCs w:val="20"/>
-        </w:rPr>
-        <w:t>regressão</w:t>
-      </w:r>
-      <w:proofErr w:type="spellEnd"/>
     </w:p>
     <w:p>
       <w:pPr>
@@ -941,34 +837,14 @@
           <w:szCs w:val="20"/>
         </w:rPr>
       </w:pPr>
-      <w:proofErr w:type="spellStart"/>
       <w:r>
         <w:rPr>
           <w:rFonts w:ascii="Arial" w:hAnsi="Arial" w:cs="Arial"/>
           <w:sz w:val="20"/>
           <w:szCs w:val="20"/>
         </w:rPr>
-        <w:t>Bibliografia</w:t>
+        <w:t>Bibliografia básica</w:t>
       </w:r>
-      <w:proofErr w:type="spellEnd"/>
-      <w:r>
-        <w:rPr>
-          <w:rFonts w:ascii="Arial" w:hAnsi="Arial" w:cs="Arial"/>
-          <w:sz w:val="20"/>
-          <w:szCs w:val="20"/>
-        </w:rPr>
-        <w:t xml:space="preserve"> </w:t>
-      </w:r>
-      <w:proofErr w:type="spellStart"/>
-      <w:r>
-        <w:rPr>
-          <w:rFonts w:ascii="Arial" w:hAnsi="Arial" w:cs="Arial"/>
-          <w:sz w:val="20"/>
-          <w:szCs w:val="20"/>
-        </w:rPr>
-        <w:t>básica</w:t>
-      </w:r>
-      <w:proofErr w:type="spellEnd"/>
     </w:p>
     <w:p>
       <w:pPr>
@@ -1113,29 +989,7 @@
           <w:szCs w:val="20"/>
           <w:lang w:val="pt-BR"/>
         </w:rPr>
-        <w:t xml:space="preserve">WOOLDRIDGE, J. Introdução à econometria: Uma abordagem moderna. São Paulo, </w:t>
-      </w:r>
-      <w:proofErr w:type="spellStart"/>
-      <w:r>
-        <w:rPr>
-          <w:rFonts w:ascii="Arial" w:eastAsia="Times New Roman" w:hAnsi="Arial" w:cs="Arial"/>
-          <w:bCs/>
-          <w:sz w:val="20"/>
-          <w:szCs w:val="20"/>
-          <w:lang w:val="pt-BR"/>
-        </w:rPr>
-        <w:t>Cengage</w:t>
-      </w:r>
-      <w:proofErr w:type="spellEnd"/>
-      <w:r>
-        <w:rPr>
-          <w:rFonts w:ascii="Arial" w:eastAsia="Times New Roman" w:hAnsi="Arial" w:cs="Arial"/>
-          <w:bCs/>
-          <w:sz w:val="20"/>
-          <w:szCs w:val="20"/>
-          <w:lang w:val="pt-BR"/>
-        </w:rPr>
-        <w:t xml:space="preserve">, 2016. </w:t>
+        <w:t xml:space="preserve">WOOLDRIDGE, J. Introdução à econometria: Uma abordagem moderna. São Paulo, Cengage, 2016. </w:t>
       </w:r>
       <w:r>
         <w:rPr>
@@ -1193,31 +1047,7 @@
           <w:shd w:val="clear" w:color="auto" w:fill="FFFFFF"/>
           <w:lang w:val="pt-BR"/>
         </w:rPr>
-        <w:t xml:space="preserve">KELLSTEDT, Paul M.; WHITTEN, Guy D. Fundamentos da pesquisa em ciência política. Editora </w:t>
-      </w:r>
-      <w:proofErr w:type="spellStart"/>
-      <w:r>
-        <w:rPr>
-          <w:rFonts w:ascii="Arial" w:hAnsi="Arial" w:cs="Arial"/>
-          <w:color w:val="222222"/>
-          <w:sz w:val="20"/>
-          <w:szCs w:val="20"/>
-          <w:shd w:val="clear" w:color="auto" w:fill="FFFFFF"/>
-          <w:lang w:val="pt-BR"/>
-        </w:rPr>
-        <w:t>Blucher</w:t>
-      </w:r>
-      <w:proofErr w:type="spellEnd"/>
-      <w:r>
-        <w:rPr>
-          <w:rFonts w:ascii="Arial" w:hAnsi="Arial" w:cs="Arial"/>
-          <w:color w:val="222222"/>
-          <w:sz w:val="20"/>
-          <w:szCs w:val="20"/>
-          <w:shd w:val="clear" w:color="auto" w:fill="FFFFFF"/>
-          <w:lang w:val="pt-BR"/>
-        </w:rPr>
-        <w:t>, 2015.</w:t>
+        <w:t>KELLSTEDT, Paul M.; WHITTEN, Guy D. Fundamentos da pesquisa em ciência política. Editora Blucher, 2015.</w:t>
       </w:r>
       <w:r>
         <w:rPr>
@@ -1305,31 +1135,7 @@
           <w:szCs w:val="20"/>
           <w:lang w:val="pt-BR"/>
         </w:rPr>
-        <w:t xml:space="preserve">Boston, MA, USA: </w:t>
-      </w:r>
-      <w:proofErr w:type="spellStart"/>
-      <w:r>
-        <w:rPr>
-          <w:rFonts w:ascii="Arial" w:eastAsia="Times New Roman" w:hAnsi="Arial" w:cs="Arial"/>
-          <w:bCs/>
-          <w:color w:val="auto"/>
-          <w:sz w:val="20"/>
-          <w:szCs w:val="20"/>
-          <w:lang w:val="pt-BR"/>
-        </w:rPr>
-        <w:t>Cengage</w:t>
-      </w:r>
-      <w:proofErr w:type="spellEnd"/>
-      <w:r>
-        <w:rPr>
-          <w:rFonts w:ascii="Arial" w:eastAsia="Times New Roman" w:hAnsi="Arial" w:cs="Arial"/>
-          <w:bCs/>
-          <w:color w:val="auto"/>
-          <w:sz w:val="20"/>
-          <w:szCs w:val="20"/>
-          <w:lang w:val="pt-BR"/>
-        </w:rPr>
-        <w:t>, 2021.</w:t>
+        <w:t>Boston, MA, USA: Cengage, 2021.</w:t>
       </w:r>
     </w:p>
     <w:p>
@@ -1378,27 +1184,7 @@
           <w:szCs w:val="20"/>
           <w:lang w:val="pt-BR"/>
         </w:rPr>
-        <w:t xml:space="preserve">GIL, </w:t>
-      </w:r>
-      <w:proofErr w:type="spellStart"/>
-      <w:r>
-        <w:rPr>
-          <w:rFonts w:ascii="Arial" w:hAnsi="Arial" w:cs="Arial"/>
-          <w:sz w:val="20"/>
-          <w:szCs w:val="20"/>
-          <w:lang w:val="pt-BR"/>
-        </w:rPr>
-        <w:t>Antonio</w:t>
-      </w:r>
-      <w:proofErr w:type="spellEnd"/>
-      <w:r>
-        <w:rPr>
-          <w:rFonts w:ascii="Arial" w:hAnsi="Arial" w:cs="Arial"/>
-          <w:sz w:val="20"/>
-          <w:szCs w:val="20"/>
-          <w:lang w:val="pt-BR"/>
-        </w:rPr>
-        <w:t xml:space="preserve"> Carlos. Como elaborar projetos de pesquisa. São Paulo, SP: Atlas, 1988. Fonte: </w:t>
+        <w:t xml:space="preserve">GIL, Antonio Carlos. Como elaborar projetos de pesquisa. São Paulo, SP: Atlas, 1988. Fonte: </w:t>
       </w:r>
       <w:hyperlink r:id="rId14" w:history="1">
         <w:r>
@@ -1902,7 +1688,6 @@
           <w:szCs w:val="20"/>
         </w:rPr>
       </w:pPr>
-      <w:proofErr w:type="spellStart"/>
       <w:r>
         <w:rPr>
           <w:rFonts w:ascii="Arial" w:hAnsi="Arial" w:cs="Arial"/>
@@ -1911,7 +1696,6 @@
         </w:rPr>
         <w:t>Avaliação</w:t>
       </w:r>
-      <w:proofErr w:type="spellEnd"/>
     </w:p>
     <w:tbl>
       <w:tblPr>
@@ -1950,7 +1734,6 @@
                 <w:szCs w:val="20"/>
               </w:rPr>
             </w:pPr>
-            <w:proofErr w:type="spellStart"/>
             <w:r>
               <w:rPr>
                 <w:rFonts w:ascii="Arial" w:hAnsi="Arial" w:cs="Arial"/>
@@ -1961,7 +1744,6 @@
               </w:rPr>
               <w:t>Componente</w:t>
             </w:r>
-            <w:proofErr w:type="spellEnd"/>
           </w:p>
         </w:tc>
         <w:tc>
@@ -1984,7 +1766,6 @@
                 <w:szCs w:val="20"/>
               </w:rPr>
             </w:pPr>
-            <w:proofErr w:type="spellStart"/>
             <w:r>
               <w:rPr>
                 <w:rFonts w:ascii="Arial" w:hAnsi="Arial" w:cs="Arial"/>
@@ -1995,7 +1776,6 @@
               </w:rPr>
               <w:t>Pontuação</w:t>
             </w:r>
-            <w:proofErr w:type="spellEnd"/>
           </w:p>
         </w:tc>
       </w:tr>
@@ -2039,41 +1819,13 @@
               </w:rPr>
               <w:t xml:space="preserve"> </w:t>
             </w:r>
-            <w:proofErr w:type="spellStart"/>
-            <w:r>
-              <w:rPr>
-                <w:rFonts w:ascii="Arial" w:hAnsi="Arial" w:cs="Arial"/>
-                <w:sz w:val="20"/>
-                <w:szCs w:val="20"/>
-              </w:rPr>
-              <w:t>Listas</w:t>
-            </w:r>
-            <w:proofErr w:type="spellEnd"/>
-            <w:r>
-              <w:rPr>
-                <w:rFonts w:ascii="Arial" w:hAnsi="Arial" w:cs="Arial"/>
-                <w:sz w:val="20"/>
-                <w:szCs w:val="20"/>
-              </w:rPr>
-              <w:t xml:space="preserve"> de </w:t>
-            </w:r>
-            <w:proofErr w:type="spellStart"/>
-            <w:r>
-              <w:rPr>
-                <w:rFonts w:ascii="Arial" w:hAnsi="Arial" w:cs="Arial"/>
-                <w:sz w:val="20"/>
-                <w:szCs w:val="20"/>
-              </w:rPr>
-              <w:t>exercícios</w:t>
-            </w:r>
-            <w:proofErr w:type="spellEnd"/>
-            <w:r>
-              <w:rPr>
-                <w:rFonts w:ascii="Arial" w:hAnsi="Arial" w:cs="Arial"/>
-                <w:sz w:val="20"/>
-                <w:szCs w:val="20"/>
-              </w:rPr>
-              <w:t xml:space="preserve"> (</w:t>
+            <w:r>
+              <w:rPr>
+                <w:rFonts w:ascii="Arial" w:hAnsi="Arial" w:cs="Arial"/>
+                <w:sz w:val="20"/>
+                <w:szCs w:val="20"/>
+              </w:rPr>
+              <w:t>Listas de exercícios (</w:t>
             </w:r>
             <w:r>
               <w:rPr>
@@ -2097,25 +1849,7 @@
                 <w:sz w:val="20"/>
                 <w:szCs w:val="20"/>
               </w:rPr>
-              <w:t xml:space="preserve">5 </w:t>
-            </w:r>
-            <w:proofErr w:type="spellStart"/>
-            <w:r>
-              <w:rPr>
-                <w:rFonts w:ascii="Arial" w:hAnsi="Arial" w:cs="Arial"/>
-                <w:sz w:val="20"/>
-                <w:szCs w:val="20"/>
-              </w:rPr>
-              <w:t>pontos</w:t>
-            </w:r>
-            <w:proofErr w:type="spellEnd"/>
-            <w:r>
-              <w:rPr>
-                <w:rFonts w:ascii="Arial" w:hAnsi="Arial" w:cs="Arial"/>
-                <w:sz w:val="20"/>
-                <w:szCs w:val="20"/>
-              </w:rPr>
-              <w:t>)</w:t>
+              <w:t>5 pontos)</w:t>
             </w:r>
           </w:p>
         </w:tc>
@@ -2160,18 +1894,8 @@
                 <w:sz w:val="20"/>
                 <w:szCs w:val="20"/>
               </w:rPr>
-              <w:t xml:space="preserve"> </w:t>
-            </w:r>
-            <w:proofErr w:type="spellStart"/>
-            <w:r>
-              <w:rPr>
-                <w:rFonts w:ascii="Arial" w:hAnsi="Arial" w:cs="Arial"/>
-                <w:sz w:val="20"/>
-                <w:szCs w:val="20"/>
-              </w:rPr>
-              <w:t>pontos</w:t>
-            </w:r>
-            <w:proofErr w:type="spellEnd"/>
+              <w:t xml:space="preserve"> pontos</w:t>
+            </w:r>
           </w:p>
         </w:tc>
       </w:tr>
@@ -2215,41 +1939,13 @@
               </w:rPr>
               <w:t xml:space="preserve"> </w:t>
             </w:r>
-            <w:proofErr w:type="spellStart"/>
-            <w:r>
-              <w:rPr>
-                <w:rFonts w:ascii="Arial" w:hAnsi="Arial" w:cs="Arial"/>
-                <w:sz w:val="20"/>
-                <w:szCs w:val="20"/>
-              </w:rPr>
-              <w:t>Provas</w:t>
-            </w:r>
-            <w:proofErr w:type="spellEnd"/>
-            <w:r>
-              <w:rPr>
-                <w:rFonts w:ascii="Arial" w:hAnsi="Arial" w:cs="Arial"/>
-                <w:sz w:val="20"/>
-                <w:szCs w:val="20"/>
-              </w:rPr>
-              <w:t xml:space="preserve"> das </w:t>
-            </w:r>
-            <w:proofErr w:type="spellStart"/>
-            <w:r>
-              <w:rPr>
-                <w:rFonts w:ascii="Arial" w:hAnsi="Arial" w:cs="Arial"/>
-                <w:sz w:val="20"/>
-                <w:szCs w:val="20"/>
-              </w:rPr>
-              <w:t>unidades</w:t>
-            </w:r>
-            <w:proofErr w:type="spellEnd"/>
-            <w:r>
-              <w:rPr>
-                <w:rFonts w:ascii="Arial" w:hAnsi="Arial" w:cs="Arial"/>
-                <w:sz w:val="20"/>
-                <w:szCs w:val="20"/>
-              </w:rPr>
-              <w:t xml:space="preserve"> (</w:t>
+            <w:r>
+              <w:rPr>
+                <w:rFonts w:ascii="Arial" w:hAnsi="Arial" w:cs="Arial"/>
+                <w:sz w:val="20"/>
+                <w:szCs w:val="20"/>
+              </w:rPr>
+              <w:t>Provas das unidades (</w:t>
             </w:r>
             <w:r>
               <w:rPr>
@@ -2289,16 +1985,7 @@
                 <w:sz w:val="20"/>
                 <w:szCs w:val="20"/>
               </w:rPr>
-              <w:t xml:space="preserve"> </w:t>
-            </w:r>
-            <w:proofErr w:type="spellStart"/>
-            <w:r>
-              <w:rPr>
-                <w:rFonts w:ascii="Arial" w:hAnsi="Arial" w:cs="Arial"/>
-                <w:sz w:val="20"/>
-                <w:szCs w:val="20"/>
-              </w:rPr>
-              <w:t>pont</w:t>
+              <w:t xml:space="preserve"> pont</w:t>
             </w:r>
             <w:r>
               <w:rPr>
@@ -2308,7 +1995,6 @@
               </w:rPr>
               <w:t>os</w:t>
             </w:r>
-            <w:proofErr w:type="spellEnd"/>
             <w:r>
               <w:rPr>
                 <w:rFonts w:ascii="Arial" w:hAnsi="Arial" w:cs="Arial"/>
@@ -2360,18 +2046,8 @@
                 <w:sz w:val="20"/>
                 <w:szCs w:val="20"/>
               </w:rPr>
-              <w:t xml:space="preserve"> </w:t>
-            </w:r>
-            <w:proofErr w:type="spellStart"/>
-            <w:r>
-              <w:rPr>
-                <w:rFonts w:ascii="Arial" w:hAnsi="Arial" w:cs="Arial"/>
-                <w:sz w:val="20"/>
-                <w:szCs w:val="20"/>
-              </w:rPr>
-              <w:t>pontos</w:t>
-            </w:r>
-            <w:proofErr w:type="spellEnd"/>
+              <w:t xml:space="preserve"> pontos</w:t>
+            </w:r>
           </w:p>
         </w:tc>
       </w:tr>
@@ -2399,23 +2075,13 @@
                 <w:szCs w:val="20"/>
               </w:rPr>
             </w:pPr>
-            <w:proofErr w:type="spellStart"/>
-            <w:r>
-              <w:rPr>
-                <w:rFonts w:ascii="Arial" w:hAnsi="Arial" w:cs="Arial"/>
-                <w:sz w:val="20"/>
-                <w:szCs w:val="20"/>
-              </w:rPr>
-              <w:t>Prova</w:t>
-            </w:r>
-            <w:proofErr w:type="spellEnd"/>
-            <w:r>
-              <w:rPr>
-                <w:rFonts w:ascii="Arial" w:hAnsi="Arial" w:cs="Arial"/>
-                <w:sz w:val="20"/>
-                <w:szCs w:val="20"/>
-              </w:rPr>
-              <w:t xml:space="preserve"> final</w:t>
+            <w:r>
+              <w:rPr>
+                <w:rFonts w:ascii="Arial" w:hAnsi="Arial" w:cs="Arial"/>
+                <w:sz w:val="20"/>
+                <w:szCs w:val="20"/>
+              </w:rPr>
+              <w:t>Prova final</w:t>
             </w:r>
           </w:p>
         </w:tc>
@@ -2438,41 +2104,13 @@
                 <w:szCs w:val="20"/>
               </w:rPr>
             </w:pPr>
-            <w:proofErr w:type="spellStart"/>
-            <w:r>
-              <w:rPr>
-                <w:rFonts w:ascii="Arial" w:hAnsi="Arial" w:cs="Arial"/>
-                <w:sz w:val="20"/>
-                <w:szCs w:val="20"/>
-              </w:rPr>
-              <w:t>Substituta</w:t>
-            </w:r>
-            <w:proofErr w:type="spellEnd"/>
-            <w:r>
-              <w:rPr>
-                <w:rFonts w:ascii="Arial" w:hAnsi="Arial" w:cs="Arial"/>
-                <w:sz w:val="20"/>
-                <w:szCs w:val="20"/>
-              </w:rPr>
-              <w:t xml:space="preserve"> da </w:t>
-            </w:r>
-            <w:proofErr w:type="spellStart"/>
-            <w:r>
-              <w:rPr>
-                <w:rFonts w:ascii="Arial" w:hAnsi="Arial" w:cs="Arial"/>
-                <w:sz w:val="20"/>
-                <w:szCs w:val="20"/>
-              </w:rPr>
-              <w:t>menor</w:t>
-            </w:r>
-            <w:proofErr w:type="spellEnd"/>
-            <w:r>
-              <w:rPr>
-                <w:rFonts w:ascii="Arial" w:hAnsi="Arial" w:cs="Arial"/>
-                <w:sz w:val="20"/>
-                <w:szCs w:val="20"/>
-              </w:rPr>
-              <w:t xml:space="preserve"> nota</w:t>
+            <w:r>
+              <w:rPr>
+                <w:rFonts w:ascii="Arial" w:hAnsi="Arial" w:cs="Arial"/>
+                <w:sz w:val="20"/>
+                <w:szCs w:val="20"/>
+              </w:rPr>
+              <w:t>Substituta da menor nota</w:t>
             </w:r>
           </w:p>
         </w:tc>
@@ -2549,19 +2187,8 @@
                 <w:sz w:val="20"/>
                 <w:szCs w:val="20"/>
               </w:rPr>
-              <w:t xml:space="preserve"> </w:t>
-            </w:r>
-            <w:proofErr w:type="spellStart"/>
-            <w:r>
-              <w:rPr>
-                <w:rFonts w:ascii="Arial" w:hAnsi="Arial" w:cs="Arial"/>
-                <w:b/>
-                <w:sz w:val="20"/>
-                <w:szCs w:val="20"/>
-              </w:rPr>
-              <w:t>pontos</w:t>
-            </w:r>
-            <w:proofErr w:type="spellEnd"/>
+              <w:t xml:space="preserve"> pontos</w:t>
+            </w:r>
           </w:p>
         </w:tc>
       </w:tr>
@@ -2819,51 +2446,15 @@
           <w:sz w:val="20"/>
           <w:szCs w:val="20"/>
         </w:rPr>
-        <w:t xml:space="preserve">Avisos </w:t>
+        <w:t>Avisos n</w:t>
       </w:r>
-      <w:proofErr w:type="spellStart"/>
       <w:r>
         <w:rPr>
           <w:rFonts w:ascii="Arial" w:hAnsi="Arial" w:cs="Arial"/>
           <w:sz w:val="20"/>
           <w:szCs w:val="20"/>
         </w:rPr>
-        <w:t>n</w:t>
-      </w:r>
-      <w:r>
-        <w:rPr>
-          <w:rFonts w:ascii="Arial" w:hAnsi="Arial" w:cs="Arial"/>
-          <w:sz w:val="20"/>
-          <w:szCs w:val="20"/>
-        </w:rPr>
-        <w:t>a</w:t>
-      </w:r>
-      <w:proofErr w:type="spellEnd"/>
-      <w:r>
-        <w:rPr>
-          <w:rFonts w:ascii="Arial" w:hAnsi="Arial" w:cs="Arial"/>
-          <w:sz w:val="20"/>
-          <w:szCs w:val="20"/>
-        </w:rPr>
-        <w:t xml:space="preserve"> </w:t>
-      </w:r>
-      <w:proofErr w:type="spellStart"/>
-      <w:r>
-        <w:rPr>
-          <w:rFonts w:ascii="Arial" w:hAnsi="Arial" w:cs="Arial"/>
-          <w:sz w:val="20"/>
-          <w:szCs w:val="20"/>
-        </w:rPr>
-        <w:t>plataforma</w:t>
-      </w:r>
-      <w:proofErr w:type="spellEnd"/>
-      <w:r>
-        <w:rPr>
-          <w:rFonts w:ascii="Arial" w:hAnsi="Arial" w:cs="Arial"/>
-          <w:sz w:val="20"/>
-          <w:szCs w:val="20"/>
-        </w:rPr>
-        <w:t xml:space="preserve"> online</w:t>
+        <w:t>a plataforma online</w:t>
       </w:r>
     </w:p>
     <w:p>
@@ -2886,36 +2477,8 @@
           <w:sz w:val="20"/>
           <w:szCs w:val="20"/>
         </w:rPr>
-        <w:t xml:space="preserve">Seus </w:t>
+        <w:t>Seus colegas de turma</w:t>
       </w:r>
-      <w:proofErr w:type="spellStart"/>
-      <w:r>
-        <w:rPr>
-          <w:rFonts w:ascii="Arial" w:hAnsi="Arial" w:cs="Arial"/>
-          <w:sz w:val="20"/>
-          <w:szCs w:val="20"/>
-        </w:rPr>
-        <w:t>colegas</w:t>
-      </w:r>
-      <w:proofErr w:type="spellEnd"/>
-      <w:r>
-        <w:rPr>
-          <w:rFonts w:ascii="Arial" w:hAnsi="Arial" w:cs="Arial"/>
-          <w:sz w:val="20"/>
-          <w:szCs w:val="20"/>
-        </w:rPr>
-        <w:t xml:space="preserve"> de </w:t>
-      </w:r>
-      <w:proofErr w:type="spellStart"/>
-      <w:r>
-        <w:rPr>
-          <w:rFonts w:ascii="Arial" w:hAnsi="Arial" w:cs="Arial"/>
-          <w:sz w:val="20"/>
-          <w:szCs w:val="20"/>
-        </w:rPr>
-        <w:t>turma</w:t>
-      </w:r>
-      <w:proofErr w:type="spellEnd"/>
       <w:r>
         <w:rPr>
           <w:rFonts w:ascii="Arial" w:hAnsi="Arial" w:cs="Arial"/>
@@ -3331,42 +2894,8 @@
                 <w:sz w:val="20"/>
                 <w:szCs w:val="20"/>
               </w:rPr>
-              <w:t xml:space="preserve">Tema, </w:t>
-            </w:r>
-            <w:proofErr w:type="spellStart"/>
-            <w:r>
-              <w:rPr>
-                <w:rFonts w:ascii="Arial" w:hAnsi="Arial" w:cs="Arial"/>
-                <w:b/>
-                <w:color w:val="FFFFFF"/>
-                <w:sz w:val="20"/>
-                <w:szCs w:val="20"/>
-              </w:rPr>
-              <w:t>atividade</w:t>
-            </w:r>
-            <w:proofErr w:type="spellEnd"/>
-            <w:r>
-              <w:rPr>
-                <w:rFonts w:ascii="Arial" w:hAnsi="Arial" w:cs="Arial"/>
-                <w:b/>
-                <w:color w:val="FFFFFF"/>
-                <w:sz w:val="20"/>
-                <w:szCs w:val="20"/>
-              </w:rPr>
-              <w:t xml:space="preserve"> e </w:t>
-            </w:r>
-            <w:proofErr w:type="spellStart"/>
-            <w:r>
-              <w:rPr>
-                <w:rFonts w:ascii="Arial" w:hAnsi="Arial" w:cs="Arial"/>
-                <w:b/>
-                <w:color w:val="FFFFFF"/>
-                <w:sz w:val="20"/>
-                <w:szCs w:val="20"/>
-              </w:rPr>
-              <w:t>leitura</w:t>
-            </w:r>
-            <w:proofErr w:type="spellEnd"/>
+              <w:t>Tema, atividade e leitura</w:t>
+            </w:r>
           </w:p>
         </w:tc>
       </w:tr>
@@ -3553,46 +3082,7 @@
                 <w:lang w:val="pt-BR"/>
               </w:rPr>
               <w:br/>
-            </w:r>
-            <w:proofErr w:type="spellStart"/>
-            <w:r>
-              <w:rPr>
-                <w:rFonts w:ascii="Arial" w:hAnsi="Arial" w:cs="Arial"/>
-                <w:sz w:val="20"/>
-                <w:szCs w:val="20"/>
-                <w:lang w:val="pt-BR"/>
-              </w:rPr>
-              <w:t>Gravetter</w:t>
-            </w:r>
-            <w:proofErr w:type="spellEnd"/>
-            <w:r>
-              <w:rPr>
-                <w:rFonts w:ascii="Arial" w:hAnsi="Arial" w:cs="Arial"/>
-                <w:sz w:val="20"/>
-                <w:szCs w:val="20"/>
-                <w:lang w:val="pt-BR"/>
-              </w:rPr>
-              <w:t xml:space="preserve"> &amp; </w:t>
-            </w:r>
-            <w:proofErr w:type="spellStart"/>
-            <w:r>
-              <w:rPr>
-                <w:rFonts w:ascii="Arial" w:hAnsi="Arial" w:cs="Arial"/>
-                <w:sz w:val="20"/>
-                <w:szCs w:val="20"/>
-                <w:lang w:val="pt-BR"/>
-              </w:rPr>
-              <w:t>Wallnau</w:t>
-            </w:r>
-            <w:proofErr w:type="spellEnd"/>
-            <w:r>
-              <w:rPr>
-                <w:rFonts w:ascii="Arial" w:hAnsi="Arial" w:cs="Arial"/>
-                <w:sz w:val="20"/>
-                <w:szCs w:val="20"/>
-                <w:lang w:val="pt-BR"/>
-              </w:rPr>
-              <w:t>, capítulo 1</w:t>
+              <w:t>Gravetter &amp; Wallnau, capítulo 1</w:t>
             </w:r>
           </w:p>
         </w:tc>
@@ -3682,46 +3172,7 @@
                 <w:lang w:val="pt-BR"/>
               </w:rPr>
               <w:br/>
-            </w:r>
-            <w:proofErr w:type="spellStart"/>
-            <w:r>
-              <w:rPr>
-                <w:rFonts w:ascii="Arial" w:hAnsi="Arial" w:cs="Arial"/>
-                <w:sz w:val="20"/>
-                <w:szCs w:val="20"/>
-                <w:lang w:val="pt-BR"/>
-              </w:rPr>
-              <w:t>Gravetter</w:t>
-            </w:r>
-            <w:proofErr w:type="spellEnd"/>
-            <w:r>
-              <w:rPr>
-                <w:rFonts w:ascii="Arial" w:hAnsi="Arial" w:cs="Arial"/>
-                <w:sz w:val="20"/>
-                <w:szCs w:val="20"/>
-                <w:lang w:val="pt-BR"/>
-              </w:rPr>
-              <w:t xml:space="preserve"> &amp; </w:t>
-            </w:r>
-            <w:proofErr w:type="spellStart"/>
-            <w:r>
-              <w:rPr>
-                <w:rFonts w:ascii="Arial" w:hAnsi="Arial" w:cs="Arial"/>
-                <w:sz w:val="20"/>
-                <w:szCs w:val="20"/>
-                <w:lang w:val="pt-BR"/>
-              </w:rPr>
-              <w:t>Wallnau</w:t>
-            </w:r>
-            <w:proofErr w:type="spellEnd"/>
-            <w:r>
-              <w:rPr>
-                <w:rFonts w:ascii="Arial" w:hAnsi="Arial" w:cs="Arial"/>
-                <w:sz w:val="20"/>
-                <w:szCs w:val="20"/>
-                <w:lang w:val="pt-BR"/>
-              </w:rPr>
-              <w:t>, capítulo 2 (exceto a seção 2.5)</w:t>
+              <w:t>Gravetter &amp; Wallnau, capítulo 2 (exceto a seção 2.5)</w:t>
             </w:r>
           </w:p>
         </w:tc>
@@ -3811,46 +3262,7 @@
                 <w:lang w:val="pt-BR"/>
               </w:rPr>
               <w:br/>
-            </w:r>
-            <w:proofErr w:type="spellStart"/>
-            <w:r>
-              <w:rPr>
-                <w:rFonts w:ascii="Arial" w:hAnsi="Arial" w:cs="Arial"/>
-                <w:sz w:val="20"/>
-                <w:szCs w:val="20"/>
-                <w:lang w:val="pt-BR"/>
-              </w:rPr>
-              <w:t>Gravetter</w:t>
-            </w:r>
-            <w:proofErr w:type="spellEnd"/>
-            <w:r>
-              <w:rPr>
-                <w:rFonts w:ascii="Arial" w:hAnsi="Arial" w:cs="Arial"/>
-                <w:sz w:val="20"/>
-                <w:szCs w:val="20"/>
-                <w:lang w:val="pt-BR"/>
-              </w:rPr>
-              <w:t xml:space="preserve"> &amp; </w:t>
-            </w:r>
-            <w:proofErr w:type="spellStart"/>
-            <w:r>
-              <w:rPr>
-                <w:rFonts w:ascii="Arial" w:hAnsi="Arial" w:cs="Arial"/>
-                <w:sz w:val="20"/>
-                <w:szCs w:val="20"/>
-                <w:lang w:val="pt-BR"/>
-              </w:rPr>
-              <w:t>Wallnau</w:t>
-            </w:r>
-            <w:proofErr w:type="spellEnd"/>
-            <w:r>
-              <w:rPr>
-                <w:rFonts w:ascii="Arial" w:hAnsi="Arial" w:cs="Arial"/>
-                <w:sz w:val="20"/>
-                <w:szCs w:val="20"/>
-                <w:lang w:val="pt-BR"/>
-              </w:rPr>
-              <w:t>, capítulo 3</w:t>
+              <w:t>Gravetter &amp; Wallnau, capítulo 3</w:t>
             </w:r>
           </w:p>
         </w:tc>
@@ -3923,7 +3335,6 @@
                 <w:lang w:val="pt-BR"/>
               </w:rPr>
             </w:pPr>
-            <w:proofErr w:type="spellStart"/>
             <w:r>
               <w:rPr>
                 <w:rFonts w:ascii="Arial" w:hAnsi="Arial" w:cs="Arial"/>
@@ -3932,7 +3343,6 @@
               </w:rPr>
               <w:t>Variabilidade</w:t>
             </w:r>
-            <w:proofErr w:type="spellEnd"/>
             <w:r>
               <w:rPr>
                 <w:rFonts w:ascii="Arial" w:hAnsi="Arial" w:cs="Arial"/>
@@ -3940,42 +3350,7 @@
                 <w:szCs w:val="20"/>
               </w:rPr>
               <w:br/>
-            </w:r>
-            <w:proofErr w:type="spellStart"/>
-            <w:r>
-              <w:rPr>
-                <w:rFonts w:ascii="Arial" w:hAnsi="Arial" w:cs="Arial"/>
-                <w:sz w:val="20"/>
-                <w:szCs w:val="20"/>
-              </w:rPr>
-              <w:t>Gravetter</w:t>
-            </w:r>
-            <w:proofErr w:type="spellEnd"/>
-            <w:r>
-              <w:rPr>
-                <w:rFonts w:ascii="Arial" w:hAnsi="Arial" w:cs="Arial"/>
-                <w:sz w:val="20"/>
-                <w:szCs w:val="20"/>
-              </w:rPr>
-              <w:t xml:space="preserve"> &amp; Wallnau, </w:t>
-            </w:r>
-            <w:proofErr w:type="spellStart"/>
-            <w:r>
-              <w:rPr>
-                <w:rFonts w:ascii="Arial" w:hAnsi="Arial" w:cs="Arial"/>
-                <w:sz w:val="20"/>
-                <w:szCs w:val="20"/>
-              </w:rPr>
-              <w:t>capítulo</w:t>
-            </w:r>
-            <w:proofErr w:type="spellEnd"/>
-            <w:r>
-              <w:rPr>
-                <w:rFonts w:ascii="Arial" w:hAnsi="Arial" w:cs="Arial"/>
-                <w:sz w:val="20"/>
-                <w:szCs w:val="20"/>
-              </w:rPr>
-              <w:t xml:space="preserve"> 4</w:t>
+              <w:t>Gravetter &amp; Wallnau, capítulo 4</w:t>
             </w:r>
           </w:p>
         </w:tc>
@@ -4172,7 +3547,6 @@
                 <w:lang w:val="pt-BR"/>
               </w:rPr>
             </w:pPr>
-            <w:proofErr w:type="spellStart"/>
             <w:r>
               <w:rPr>
                 <w:rFonts w:ascii="Arial" w:hAnsi="Arial" w:cs="Arial"/>
@@ -4182,43 +3556,7 @@
                 <w:sz w:val="20"/>
                 <w:szCs w:val="20"/>
               </w:rPr>
-              <w:t>Prova</w:t>
-            </w:r>
-            <w:proofErr w:type="spellEnd"/>
-            <w:r>
-              <w:rPr>
-                <w:rFonts w:ascii="Arial" w:hAnsi="Arial" w:cs="Arial"/>
-                <w:b/>
-                <w:bCs/>
-                <w:color w:val="00B050"/>
-                <w:sz w:val="20"/>
-                <w:szCs w:val="20"/>
-              </w:rPr>
-              <w:t xml:space="preserve"> da </w:t>
-            </w:r>
-            <w:proofErr w:type="spellStart"/>
-            <w:r>
-              <w:rPr>
-                <w:rFonts w:ascii="Arial" w:hAnsi="Arial" w:cs="Arial"/>
-                <w:b/>
-                <w:bCs/>
-                <w:color w:val="00B050"/>
-                <w:sz w:val="20"/>
-                <w:szCs w:val="20"/>
-              </w:rPr>
-              <w:t>Unidade</w:t>
-            </w:r>
-            <w:proofErr w:type="spellEnd"/>
-            <w:r>
-              <w:rPr>
-                <w:rFonts w:ascii="Arial" w:hAnsi="Arial" w:cs="Arial"/>
-                <w:b/>
-                <w:bCs/>
-                <w:color w:val="00B050"/>
-                <w:sz w:val="20"/>
-                <w:szCs w:val="20"/>
-              </w:rPr>
-              <w:t xml:space="preserve"> 1</w:t>
+              <w:t>Prova da Unidade 1</w:t>
             </w:r>
           </w:p>
         </w:tc>
@@ -4244,60 +3582,30 @@
           <w:szCs w:val="20"/>
         </w:rPr>
       </w:pPr>
-      <w:proofErr w:type="spellStart"/>
       <w:r>
         <w:rPr>
           <w:rFonts w:ascii="Arial" w:hAnsi="Arial" w:cs="Arial"/>
           <w:sz w:val="20"/>
           <w:szCs w:val="20"/>
         </w:rPr>
-        <w:t>Unidade</w:t>
+        <w:t xml:space="preserve">Unidade 2: </w:t>
       </w:r>
-      <w:proofErr w:type="spellEnd"/>
       <w:r>
         <w:rPr>
           <w:rFonts w:ascii="Arial" w:hAnsi="Arial" w:cs="Arial"/>
           <w:sz w:val="20"/>
           <w:szCs w:val="20"/>
         </w:rPr>
-        <w:t xml:space="preserve"> 2: </w:t>
+        <w:t>Introdução à p</w:t>
       </w:r>
-      <w:proofErr w:type="spellStart"/>
       <w:r>
         <w:rPr>
           <w:rFonts w:ascii="Arial" w:hAnsi="Arial" w:cs="Arial"/>
           <w:sz w:val="20"/>
           <w:szCs w:val="20"/>
         </w:rPr>
-        <w:t>Introdução</w:t>
-      </w:r>
-      <w:proofErr w:type="spellEnd"/>
-      <w:r>
-        <w:rPr>
-          <w:rFonts w:ascii="Arial" w:hAnsi="Arial" w:cs="Arial"/>
-          <w:sz w:val="20"/>
-          <w:szCs w:val="20"/>
-        </w:rPr>
-        <w:t xml:space="preserve"> à </w:t>
-      </w:r>
-      <w:proofErr w:type="spellStart"/>
-      <w:r>
-        <w:rPr>
-          <w:rFonts w:ascii="Arial" w:hAnsi="Arial" w:cs="Arial"/>
-          <w:sz w:val="20"/>
-          <w:szCs w:val="20"/>
-        </w:rPr>
-        <w:t>p</w:t>
-      </w:r>
-      <w:r>
-        <w:rPr>
-          <w:rFonts w:ascii="Arial" w:hAnsi="Arial" w:cs="Arial"/>
-          <w:sz w:val="20"/>
-          <w:szCs w:val="20"/>
-        </w:rPr>
         <w:t>robabilidade</w:t>
       </w:r>
-      <w:proofErr w:type="spellEnd"/>
     </w:p>
     <w:tbl>
       <w:tblPr>
@@ -4376,42 +3684,8 @@
                 <w:sz w:val="20"/>
                 <w:szCs w:val="20"/>
               </w:rPr>
-              <w:t xml:space="preserve">Tema, </w:t>
-            </w:r>
-            <w:proofErr w:type="spellStart"/>
-            <w:r>
-              <w:rPr>
-                <w:rFonts w:ascii="Arial" w:hAnsi="Arial" w:cs="Arial"/>
-                <w:b/>
-                <w:color w:val="FFFFFF"/>
-                <w:sz w:val="20"/>
-                <w:szCs w:val="20"/>
-              </w:rPr>
-              <w:t>atividade</w:t>
-            </w:r>
-            <w:proofErr w:type="spellEnd"/>
-            <w:r>
-              <w:rPr>
-                <w:rFonts w:ascii="Arial" w:hAnsi="Arial" w:cs="Arial"/>
-                <w:b/>
-                <w:color w:val="FFFFFF"/>
-                <w:sz w:val="20"/>
-                <w:szCs w:val="20"/>
-              </w:rPr>
-              <w:t xml:space="preserve"> e </w:t>
-            </w:r>
-            <w:proofErr w:type="spellStart"/>
-            <w:r>
-              <w:rPr>
-                <w:rFonts w:ascii="Arial" w:hAnsi="Arial" w:cs="Arial"/>
-                <w:b/>
-                <w:color w:val="FFFFFF"/>
-                <w:sz w:val="20"/>
-                <w:szCs w:val="20"/>
-              </w:rPr>
-              <w:t>leitura</w:t>
-            </w:r>
-            <w:proofErr w:type="spellEnd"/>
+              <w:t>Tema, atividade e leitura</w:t>
+            </w:r>
           </w:p>
         </w:tc>
       </w:tr>
@@ -4607,46 +3881,7 @@
                 <w:lang w:val="pt-BR"/>
               </w:rPr>
               <w:br/>
-            </w:r>
-            <w:proofErr w:type="spellStart"/>
-            <w:r>
-              <w:rPr>
-                <w:rFonts w:ascii="Arial" w:hAnsi="Arial" w:cs="Arial"/>
-                <w:sz w:val="20"/>
-                <w:szCs w:val="20"/>
-                <w:lang w:val="pt-BR"/>
-              </w:rPr>
-              <w:t>Gravetter</w:t>
-            </w:r>
-            <w:proofErr w:type="spellEnd"/>
-            <w:r>
-              <w:rPr>
-                <w:rFonts w:ascii="Arial" w:hAnsi="Arial" w:cs="Arial"/>
-                <w:sz w:val="20"/>
-                <w:szCs w:val="20"/>
-                <w:lang w:val="pt-BR"/>
-              </w:rPr>
-              <w:t xml:space="preserve"> &amp; </w:t>
-            </w:r>
-            <w:proofErr w:type="spellStart"/>
-            <w:r>
-              <w:rPr>
-                <w:rFonts w:ascii="Arial" w:hAnsi="Arial" w:cs="Arial"/>
-                <w:sz w:val="20"/>
-                <w:szCs w:val="20"/>
-                <w:lang w:val="pt-BR"/>
-              </w:rPr>
-              <w:t>Wallnau</w:t>
-            </w:r>
-            <w:proofErr w:type="spellEnd"/>
-            <w:r>
-              <w:rPr>
-                <w:rFonts w:ascii="Arial" w:hAnsi="Arial" w:cs="Arial"/>
-                <w:sz w:val="20"/>
-                <w:szCs w:val="20"/>
-                <w:lang w:val="pt-BR"/>
-              </w:rPr>
-              <w:t>, capítulo 6 (exceto a seção 6.4)</w:t>
+              <w:t>Gravetter &amp; Wallnau, capítulo 6 (exceto a seção 6.4)</w:t>
             </w:r>
           </w:p>
         </w:tc>
@@ -4748,46 +3983,7 @@
                 <w:lang w:val="pt-BR"/>
               </w:rPr>
               <w:br/>
-            </w:r>
-            <w:proofErr w:type="spellStart"/>
-            <w:r>
-              <w:rPr>
-                <w:rFonts w:ascii="Arial" w:hAnsi="Arial" w:cs="Arial"/>
-                <w:sz w:val="20"/>
-                <w:szCs w:val="20"/>
-                <w:lang w:val="pt-BR"/>
-              </w:rPr>
-              <w:t>Gravetter</w:t>
-            </w:r>
-            <w:proofErr w:type="spellEnd"/>
-            <w:r>
-              <w:rPr>
-                <w:rFonts w:ascii="Arial" w:hAnsi="Arial" w:cs="Arial"/>
-                <w:sz w:val="20"/>
-                <w:szCs w:val="20"/>
-                <w:lang w:val="pt-BR"/>
-              </w:rPr>
-              <w:t xml:space="preserve"> &amp; </w:t>
-            </w:r>
-            <w:proofErr w:type="spellStart"/>
-            <w:r>
-              <w:rPr>
-                <w:rFonts w:ascii="Arial" w:hAnsi="Arial" w:cs="Arial"/>
-                <w:sz w:val="20"/>
-                <w:szCs w:val="20"/>
-                <w:lang w:val="pt-BR"/>
-              </w:rPr>
-              <w:t>Wallnau</w:t>
-            </w:r>
-            <w:proofErr w:type="spellEnd"/>
-            <w:r>
-              <w:rPr>
-                <w:rFonts w:ascii="Arial" w:hAnsi="Arial" w:cs="Arial"/>
-                <w:sz w:val="20"/>
-                <w:szCs w:val="20"/>
-                <w:lang w:val="pt-BR"/>
-              </w:rPr>
-              <w:t>, capítulo 7</w:t>
+              <w:t>Gravetter &amp; Wallnau, capítulo 7</w:t>
             </w:r>
           </w:p>
         </w:tc>
@@ -5331,42 +4527,8 @@
                 <w:sz w:val="20"/>
                 <w:szCs w:val="20"/>
               </w:rPr>
-              <w:t xml:space="preserve">Tema, </w:t>
-            </w:r>
-            <w:proofErr w:type="spellStart"/>
-            <w:r>
-              <w:rPr>
-                <w:rFonts w:ascii="Arial" w:hAnsi="Arial" w:cs="Arial"/>
-                <w:b/>
-                <w:color w:val="FFFFFF"/>
-                <w:sz w:val="20"/>
-                <w:szCs w:val="20"/>
-              </w:rPr>
-              <w:t>atividade</w:t>
-            </w:r>
-            <w:proofErr w:type="spellEnd"/>
-            <w:r>
-              <w:rPr>
-                <w:rFonts w:ascii="Arial" w:hAnsi="Arial" w:cs="Arial"/>
-                <w:b/>
-                <w:color w:val="FFFFFF"/>
-                <w:sz w:val="20"/>
-                <w:szCs w:val="20"/>
-              </w:rPr>
-              <w:t xml:space="preserve"> e </w:t>
-            </w:r>
-            <w:proofErr w:type="spellStart"/>
-            <w:r>
-              <w:rPr>
-                <w:rFonts w:ascii="Arial" w:hAnsi="Arial" w:cs="Arial"/>
-                <w:b/>
-                <w:color w:val="FFFFFF"/>
-                <w:sz w:val="20"/>
-                <w:szCs w:val="20"/>
-              </w:rPr>
-              <w:t>leitura</w:t>
-            </w:r>
-            <w:proofErr w:type="spellEnd"/>
+              <w:t>Tema, atividade e leitura</w:t>
+            </w:r>
           </w:p>
         </w:tc>
       </w:tr>
@@ -5403,9 +4565,8 @@
                 <w:sz w:val="20"/>
                 <w:szCs w:val="20"/>
               </w:rPr>
-              <w:t>06/</w:t>
-            </w:r>
-            <w:proofErr w:type="gramStart"/>
+              <w:t>06/10</w:t>
+            </w:r>
             <w:r>
               <w:rPr>
                 <w:rFonts w:ascii="Arial" w:hAnsi="Arial" w:cs="Arial"/>
@@ -5414,28 +4575,7 @@
                 <w:sz w:val="20"/>
                 <w:szCs w:val="20"/>
               </w:rPr>
-              <w:t>10</w:t>
-            </w:r>
-            <w:r>
-              <w:rPr>
-                <w:rFonts w:ascii="Arial" w:hAnsi="Arial" w:cs="Arial"/>
-                <w:b/>
-                <w:color w:val="17384D"/>
-                <w:sz w:val="20"/>
-                <w:szCs w:val="20"/>
-              </w:rPr>
-              <w:t xml:space="preserve">  –</w:t>
-            </w:r>
-            <w:proofErr w:type="gramEnd"/>
-            <w:r>
-              <w:rPr>
-                <w:rFonts w:ascii="Arial" w:hAnsi="Arial" w:cs="Arial"/>
-                <w:b/>
-                <w:color w:val="17384D"/>
-                <w:sz w:val="20"/>
-                <w:szCs w:val="20"/>
-              </w:rPr>
-              <w:t xml:space="preserve"> Aula 12</w:t>
+              <w:t xml:space="preserve">  – Aula 12</w:t>
             </w:r>
           </w:p>
         </w:tc>
@@ -5477,46 +4617,7 @@
                 <w:lang w:val="pt-BR"/>
               </w:rPr>
               <w:br/>
-            </w:r>
-            <w:proofErr w:type="spellStart"/>
-            <w:r>
-              <w:rPr>
-                <w:rFonts w:ascii="Arial" w:hAnsi="Arial" w:cs="Arial"/>
-                <w:sz w:val="20"/>
-                <w:szCs w:val="20"/>
-                <w:lang w:val="pt-BR"/>
-              </w:rPr>
-              <w:t>Gravetter</w:t>
-            </w:r>
-            <w:proofErr w:type="spellEnd"/>
-            <w:r>
-              <w:rPr>
-                <w:rFonts w:ascii="Arial" w:hAnsi="Arial" w:cs="Arial"/>
-                <w:sz w:val="20"/>
-                <w:szCs w:val="20"/>
-                <w:lang w:val="pt-BR"/>
-              </w:rPr>
-              <w:t xml:space="preserve"> &amp; </w:t>
-            </w:r>
-            <w:proofErr w:type="spellStart"/>
-            <w:r>
-              <w:rPr>
-                <w:rFonts w:ascii="Arial" w:hAnsi="Arial" w:cs="Arial"/>
-                <w:sz w:val="20"/>
-                <w:szCs w:val="20"/>
-                <w:lang w:val="pt-BR"/>
-              </w:rPr>
-              <w:t>Wallnau</w:t>
-            </w:r>
-            <w:proofErr w:type="spellEnd"/>
-            <w:r>
-              <w:rPr>
-                <w:rFonts w:ascii="Arial" w:hAnsi="Arial" w:cs="Arial"/>
-                <w:sz w:val="20"/>
-                <w:szCs w:val="20"/>
-                <w:lang w:val="pt-BR"/>
-              </w:rPr>
-              <w:t>, capítulo 8</w:t>
+              <w:t>Gravetter &amp; Wallnau, capítulo 8</w:t>
             </w:r>
           </w:p>
         </w:tc>
@@ -5606,46 +4707,7 @@
                 <w:lang w:val="pt-BR"/>
               </w:rPr>
               <w:br/>
-            </w:r>
-            <w:proofErr w:type="spellStart"/>
-            <w:r>
-              <w:rPr>
-                <w:rFonts w:ascii="Arial" w:hAnsi="Arial" w:cs="Arial"/>
-                <w:sz w:val="20"/>
-                <w:szCs w:val="20"/>
-                <w:lang w:val="pt-BR"/>
-              </w:rPr>
-              <w:t>Gravetter</w:t>
-            </w:r>
-            <w:proofErr w:type="spellEnd"/>
-            <w:r>
-              <w:rPr>
-                <w:rFonts w:ascii="Arial" w:hAnsi="Arial" w:cs="Arial"/>
-                <w:sz w:val="20"/>
-                <w:szCs w:val="20"/>
-                <w:lang w:val="pt-BR"/>
-              </w:rPr>
-              <w:t xml:space="preserve"> &amp; </w:t>
-            </w:r>
-            <w:proofErr w:type="spellStart"/>
-            <w:r>
-              <w:rPr>
-                <w:rFonts w:ascii="Arial" w:hAnsi="Arial" w:cs="Arial"/>
-                <w:sz w:val="20"/>
-                <w:szCs w:val="20"/>
-                <w:lang w:val="pt-BR"/>
-              </w:rPr>
-              <w:t>Wallnau</w:t>
-            </w:r>
-            <w:proofErr w:type="spellEnd"/>
-            <w:r>
-              <w:rPr>
-                <w:rFonts w:ascii="Arial" w:hAnsi="Arial" w:cs="Arial"/>
-                <w:sz w:val="20"/>
-                <w:szCs w:val="20"/>
-                <w:lang w:val="pt-BR"/>
-              </w:rPr>
-              <w:t>, capítulo 9</w:t>
+              <w:t>Gravetter &amp; Wallnau, capítulo 9</w:t>
             </w:r>
           </w:p>
         </w:tc>
@@ -5735,46 +4797,7 @@
                 <w:lang w:val="pt-BR"/>
               </w:rPr>
               <w:br/>
-            </w:r>
-            <w:proofErr w:type="spellStart"/>
-            <w:r>
-              <w:rPr>
-                <w:rFonts w:ascii="Arial" w:hAnsi="Arial" w:cs="Arial"/>
-                <w:sz w:val="20"/>
-                <w:szCs w:val="20"/>
-                <w:lang w:val="pt-BR"/>
-              </w:rPr>
-              <w:t>Gravetter</w:t>
-            </w:r>
-            <w:proofErr w:type="spellEnd"/>
-            <w:r>
-              <w:rPr>
-                <w:rFonts w:ascii="Arial" w:hAnsi="Arial" w:cs="Arial"/>
-                <w:sz w:val="20"/>
-                <w:szCs w:val="20"/>
-                <w:lang w:val="pt-BR"/>
-              </w:rPr>
-              <w:t xml:space="preserve"> &amp; </w:t>
-            </w:r>
-            <w:proofErr w:type="spellStart"/>
-            <w:r>
-              <w:rPr>
-                <w:rFonts w:ascii="Arial" w:hAnsi="Arial" w:cs="Arial"/>
-                <w:sz w:val="20"/>
-                <w:szCs w:val="20"/>
-                <w:lang w:val="pt-BR"/>
-              </w:rPr>
-              <w:t>Wallnau</w:t>
-            </w:r>
-            <w:proofErr w:type="spellEnd"/>
-            <w:r>
-              <w:rPr>
-                <w:rFonts w:ascii="Arial" w:hAnsi="Arial" w:cs="Arial"/>
-                <w:sz w:val="20"/>
-                <w:szCs w:val="20"/>
-                <w:lang w:val="pt-BR"/>
-              </w:rPr>
-              <w:t xml:space="preserve">, capítulo 10 </w:t>
+              <w:t xml:space="preserve">Gravetter &amp; Wallnau, capítulo 10 </w:t>
             </w:r>
             <w:r>
               <w:rPr>
@@ -5882,46 +4905,7 @@
                 <w:lang w:val="pt-BR"/>
               </w:rPr>
               <w:br/>
-            </w:r>
-            <w:proofErr w:type="spellStart"/>
-            <w:r>
-              <w:rPr>
-                <w:rFonts w:ascii="Arial" w:hAnsi="Arial" w:cs="Arial"/>
-                <w:sz w:val="20"/>
-                <w:szCs w:val="20"/>
-                <w:lang w:val="pt-BR"/>
-              </w:rPr>
-              <w:t>Gravetter</w:t>
-            </w:r>
-            <w:proofErr w:type="spellEnd"/>
-            <w:r>
-              <w:rPr>
-                <w:rFonts w:ascii="Arial" w:hAnsi="Arial" w:cs="Arial"/>
-                <w:sz w:val="20"/>
-                <w:szCs w:val="20"/>
-                <w:lang w:val="pt-BR"/>
-              </w:rPr>
-              <w:t xml:space="preserve"> &amp; </w:t>
-            </w:r>
-            <w:proofErr w:type="spellStart"/>
-            <w:r>
-              <w:rPr>
-                <w:rFonts w:ascii="Arial" w:hAnsi="Arial" w:cs="Arial"/>
-                <w:sz w:val="20"/>
-                <w:szCs w:val="20"/>
-                <w:lang w:val="pt-BR"/>
-              </w:rPr>
-              <w:t>Wallnau</w:t>
-            </w:r>
-            <w:proofErr w:type="spellEnd"/>
-            <w:r>
-              <w:rPr>
-                <w:rFonts w:ascii="Arial" w:hAnsi="Arial" w:cs="Arial"/>
-                <w:sz w:val="20"/>
-                <w:szCs w:val="20"/>
-                <w:lang w:val="pt-BR"/>
-              </w:rPr>
-              <w:t xml:space="preserve">, capítulo 10 </w:t>
+              <w:t xml:space="preserve">Gravetter &amp; Wallnau, capítulo 10 </w:t>
             </w:r>
             <w:r>
               <w:rPr>
@@ -6271,7 +5255,6 @@
                 <w:lang w:val="pt-BR"/>
               </w:rPr>
             </w:pPr>
-            <w:proofErr w:type="spellStart"/>
             <w:r>
               <w:rPr>
                 <w:rFonts w:ascii="Arial" w:hAnsi="Arial" w:cs="Arial"/>
@@ -6281,43 +5264,7 @@
                 <w:sz w:val="20"/>
                 <w:szCs w:val="20"/>
               </w:rPr>
-              <w:t>Prova</w:t>
-            </w:r>
-            <w:proofErr w:type="spellEnd"/>
-            <w:r>
-              <w:rPr>
-                <w:rFonts w:ascii="Arial" w:hAnsi="Arial" w:cs="Arial"/>
-                <w:b/>
-                <w:bCs/>
-                <w:color w:val="00B050"/>
-                <w:sz w:val="20"/>
-                <w:szCs w:val="20"/>
-              </w:rPr>
-              <w:t xml:space="preserve"> da </w:t>
-            </w:r>
-            <w:proofErr w:type="spellStart"/>
-            <w:r>
-              <w:rPr>
-                <w:rFonts w:ascii="Arial" w:hAnsi="Arial" w:cs="Arial"/>
-                <w:b/>
-                <w:bCs/>
-                <w:color w:val="00B050"/>
-                <w:sz w:val="20"/>
-                <w:szCs w:val="20"/>
-              </w:rPr>
-              <w:t>Unidade</w:t>
-            </w:r>
-            <w:proofErr w:type="spellEnd"/>
-            <w:r>
-              <w:rPr>
-                <w:rFonts w:ascii="Arial" w:hAnsi="Arial" w:cs="Arial"/>
-                <w:b/>
-                <w:bCs/>
-                <w:color w:val="00B050"/>
-                <w:sz w:val="20"/>
-                <w:szCs w:val="20"/>
-              </w:rPr>
-              <w:t xml:space="preserve"> 3</w:t>
+              <w:t>Prova da Unidade 3</w:t>
             </w:r>
           </w:p>
         </w:tc>
@@ -6484,42 +5431,8 @@
                 <w:sz w:val="20"/>
                 <w:szCs w:val="20"/>
               </w:rPr>
-              <w:t xml:space="preserve">Tema, </w:t>
-            </w:r>
-            <w:proofErr w:type="spellStart"/>
-            <w:r>
-              <w:rPr>
-                <w:rFonts w:ascii="Arial" w:hAnsi="Arial" w:cs="Arial"/>
-                <w:b/>
-                <w:color w:val="FFFFFF"/>
-                <w:sz w:val="20"/>
-                <w:szCs w:val="20"/>
-              </w:rPr>
-              <w:t>atividade</w:t>
-            </w:r>
-            <w:proofErr w:type="spellEnd"/>
-            <w:r>
-              <w:rPr>
-                <w:rFonts w:ascii="Arial" w:hAnsi="Arial" w:cs="Arial"/>
-                <w:b/>
-                <w:color w:val="FFFFFF"/>
-                <w:sz w:val="20"/>
-                <w:szCs w:val="20"/>
-              </w:rPr>
-              <w:t xml:space="preserve"> e </w:t>
-            </w:r>
-            <w:proofErr w:type="spellStart"/>
-            <w:r>
-              <w:rPr>
-                <w:rFonts w:ascii="Arial" w:hAnsi="Arial" w:cs="Arial"/>
-                <w:b/>
-                <w:color w:val="FFFFFF"/>
-                <w:sz w:val="20"/>
-                <w:szCs w:val="20"/>
-              </w:rPr>
-              <w:t>leitura</w:t>
-            </w:r>
-            <w:proofErr w:type="spellEnd"/>
+              <w:t>Tema, atividade e leitura</w:t>
+            </w:r>
           </w:p>
         </w:tc>
       </w:tr>
@@ -6600,46 +5513,7 @@
                 <w:lang w:val="pt-BR"/>
               </w:rPr>
               <w:br/>
-            </w:r>
-            <w:proofErr w:type="spellStart"/>
-            <w:r>
-              <w:rPr>
-                <w:rFonts w:ascii="Arial" w:hAnsi="Arial" w:cs="Arial"/>
-                <w:sz w:val="20"/>
-                <w:szCs w:val="20"/>
-                <w:lang w:val="pt-BR"/>
-              </w:rPr>
-              <w:t>Gravetter</w:t>
-            </w:r>
-            <w:proofErr w:type="spellEnd"/>
-            <w:r>
-              <w:rPr>
-                <w:rFonts w:ascii="Arial" w:hAnsi="Arial" w:cs="Arial"/>
-                <w:sz w:val="20"/>
-                <w:szCs w:val="20"/>
-                <w:lang w:val="pt-BR"/>
-              </w:rPr>
-              <w:t xml:space="preserve"> &amp; </w:t>
-            </w:r>
-            <w:proofErr w:type="spellStart"/>
-            <w:r>
-              <w:rPr>
-                <w:rFonts w:ascii="Arial" w:hAnsi="Arial" w:cs="Arial"/>
-                <w:sz w:val="20"/>
-                <w:szCs w:val="20"/>
-                <w:lang w:val="pt-BR"/>
-              </w:rPr>
-              <w:t>Wallnau</w:t>
-            </w:r>
-            <w:proofErr w:type="spellEnd"/>
-            <w:r>
-              <w:rPr>
-                <w:rFonts w:ascii="Arial" w:hAnsi="Arial" w:cs="Arial"/>
-                <w:sz w:val="20"/>
-                <w:szCs w:val="20"/>
-                <w:lang w:val="pt-BR"/>
-              </w:rPr>
-              <w:t>, capítulo 15 (exceto a seção 15.5)</w:t>
+              <w:t>Gravetter &amp; Wallnau, capítulo 15 (exceto a seção 15.5)</w:t>
             </w:r>
           </w:p>
         </w:tc>
@@ -6721,46 +5595,7 @@
                 <w:lang w:val="pt-BR"/>
               </w:rPr>
               <w:br/>
-            </w:r>
-            <w:proofErr w:type="spellStart"/>
-            <w:r>
-              <w:rPr>
-                <w:rFonts w:ascii="Arial" w:hAnsi="Arial" w:cs="Arial"/>
-                <w:sz w:val="20"/>
-                <w:szCs w:val="20"/>
-                <w:lang w:val="pt-BR"/>
-              </w:rPr>
-              <w:t>Gravetter</w:t>
-            </w:r>
-            <w:proofErr w:type="spellEnd"/>
-            <w:r>
-              <w:rPr>
-                <w:rFonts w:ascii="Arial" w:hAnsi="Arial" w:cs="Arial"/>
-                <w:sz w:val="20"/>
-                <w:szCs w:val="20"/>
-                <w:lang w:val="pt-BR"/>
-              </w:rPr>
-              <w:t xml:space="preserve"> &amp; </w:t>
-            </w:r>
-            <w:proofErr w:type="spellStart"/>
-            <w:r>
-              <w:rPr>
-                <w:rFonts w:ascii="Arial" w:hAnsi="Arial" w:cs="Arial"/>
-                <w:sz w:val="20"/>
-                <w:szCs w:val="20"/>
-                <w:lang w:val="pt-BR"/>
-              </w:rPr>
-              <w:t>Wallnau</w:t>
-            </w:r>
-            <w:proofErr w:type="spellEnd"/>
-            <w:r>
-              <w:rPr>
-                <w:rFonts w:ascii="Arial" w:hAnsi="Arial" w:cs="Arial"/>
-                <w:sz w:val="20"/>
-                <w:szCs w:val="20"/>
-                <w:lang w:val="pt-BR"/>
-              </w:rPr>
-              <w:t>, capítulo 15 (exceto a seção 15.5)</w:t>
+              <w:t>Gravetter &amp; Wallnau, capítulo 15 (exceto a seção 15.5)</w:t>
             </w:r>
           </w:p>
         </w:tc>
@@ -6842,46 +5677,7 @@
                 <w:lang w:val="pt-BR"/>
               </w:rPr>
               <w:br/>
-            </w:r>
-            <w:proofErr w:type="spellStart"/>
-            <w:r>
-              <w:rPr>
-                <w:rFonts w:ascii="Arial" w:hAnsi="Arial" w:cs="Arial"/>
-                <w:sz w:val="20"/>
-                <w:szCs w:val="20"/>
-                <w:lang w:val="pt-BR"/>
-              </w:rPr>
-              <w:t>Gravetter</w:t>
-            </w:r>
-            <w:proofErr w:type="spellEnd"/>
-            <w:r>
-              <w:rPr>
-                <w:rFonts w:ascii="Arial" w:hAnsi="Arial" w:cs="Arial"/>
-                <w:sz w:val="20"/>
-                <w:szCs w:val="20"/>
-                <w:lang w:val="pt-BR"/>
-              </w:rPr>
-              <w:t xml:space="preserve"> &amp; </w:t>
-            </w:r>
-            <w:proofErr w:type="spellStart"/>
-            <w:r>
-              <w:rPr>
-                <w:rFonts w:ascii="Arial" w:hAnsi="Arial" w:cs="Arial"/>
-                <w:sz w:val="20"/>
-                <w:szCs w:val="20"/>
-                <w:lang w:val="pt-BR"/>
-              </w:rPr>
-              <w:t>Wallnau</w:t>
-            </w:r>
-            <w:proofErr w:type="spellEnd"/>
-            <w:r>
-              <w:rPr>
-                <w:rFonts w:ascii="Arial" w:hAnsi="Arial" w:cs="Arial"/>
-                <w:sz w:val="20"/>
-                <w:szCs w:val="20"/>
-                <w:lang w:val="pt-BR"/>
-              </w:rPr>
-              <w:t>, capítulo 16, somente páginas 529–537, 544–545 e 551–552</w:t>
+              <w:t>Gravetter &amp; Wallnau, capítulo 16, somente páginas 529–537, 544–545 e 551–552</w:t>
             </w:r>
           </w:p>
         </w:tc>
@@ -6963,46 +5759,7 @@
                 <w:lang w:val="pt-BR"/>
               </w:rPr>
               <w:br/>
-            </w:r>
-            <w:proofErr w:type="spellStart"/>
-            <w:r>
-              <w:rPr>
-                <w:rFonts w:ascii="Arial" w:hAnsi="Arial" w:cs="Arial"/>
-                <w:sz w:val="20"/>
-                <w:szCs w:val="20"/>
-                <w:lang w:val="pt-BR"/>
-              </w:rPr>
-              <w:t>Gravetter</w:t>
-            </w:r>
-            <w:proofErr w:type="spellEnd"/>
-            <w:r>
-              <w:rPr>
-                <w:rFonts w:ascii="Arial" w:hAnsi="Arial" w:cs="Arial"/>
-                <w:sz w:val="20"/>
-                <w:szCs w:val="20"/>
-                <w:lang w:val="pt-BR"/>
-              </w:rPr>
-              <w:t xml:space="preserve"> &amp; </w:t>
-            </w:r>
-            <w:proofErr w:type="spellStart"/>
-            <w:r>
-              <w:rPr>
-                <w:rFonts w:ascii="Arial" w:hAnsi="Arial" w:cs="Arial"/>
-                <w:sz w:val="20"/>
-                <w:szCs w:val="20"/>
-                <w:lang w:val="pt-BR"/>
-              </w:rPr>
-              <w:t>Wallnau</w:t>
-            </w:r>
-            <w:proofErr w:type="spellEnd"/>
-            <w:r>
-              <w:rPr>
-                <w:rFonts w:ascii="Arial" w:hAnsi="Arial" w:cs="Arial"/>
-                <w:sz w:val="20"/>
-                <w:szCs w:val="20"/>
-                <w:lang w:val="pt-BR"/>
-              </w:rPr>
-              <w:t>, capítulo 16, somente páginas 529–537, 544–545 e 551–552</w:t>
+              <w:t>Gravetter &amp; Wallnau, capítulo 16, somente páginas 529–537, 544–545 e 551–552</w:t>
             </w:r>
           </w:p>
         </w:tc>
@@ -7084,46 +5841,7 @@
                 <w:lang w:val="pt-BR"/>
               </w:rPr>
               <w:br/>
-            </w:r>
-            <w:proofErr w:type="spellStart"/>
-            <w:r>
-              <w:rPr>
-                <w:rFonts w:ascii="Arial" w:hAnsi="Arial" w:cs="Arial"/>
-                <w:sz w:val="20"/>
-                <w:szCs w:val="20"/>
-                <w:lang w:val="pt-BR"/>
-              </w:rPr>
-              <w:t>Gravetter</w:t>
-            </w:r>
-            <w:proofErr w:type="spellEnd"/>
-            <w:r>
-              <w:rPr>
-                <w:rFonts w:ascii="Arial" w:hAnsi="Arial" w:cs="Arial"/>
-                <w:sz w:val="20"/>
-                <w:szCs w:val="20"/>
-                <w:lang w:val="pt-BR"/>
-              </w:rPr>
-              <w:t xml:space="preserve"> &amp; </w:t>
-            </w:r>
-            <w:proofErr w:type="spellStart"/>
-            <w:r>
-              <w:rPr>
-                <w:rFonts w:ascii="Arial" w:hAnsi="Arial" w:cs="Arial"/>
-                <w:sz w:val="20"/>
-                <w:szCs w:val="20"/>
-                <w:lang w:val="pt-BR"/>
-              </w:rPr>
-              <w:t>Wallnau</w:t>
-            </w:r>
-            <w:proofErr w:type="spellEnd"/>
-            <w:r>
-              <w:rPr>
-                <w:rFonts w:ascii="Arial" w:hAnsi="Arial" w:cs="Arial"/>
-                <w:sz w:val="20"/>
-                <w:szCs w:val="20"/>
-                <w:lang w:val="pt-BR"/>
-              </w:rPr>
-              <w:t>, capítulo 16, somente páginas 529–537, 544–545 e 551–552</w:t>
+              <w:t>Gravetter &amp; Wallnau, capítulo 16, somente páginas 529–537, 544–545 e 551–552</w:t>
             </w:r>
           </w:p>
         </w:tc>
@@ -7281,16 +5999,7 @@
                 <w:szCs w:val="20"/>
                 <w:lang w:val="pt-BR"/>
               </w:rPr>
-              <w:t xml:space="preserve">computacional </w:t>
-            </w:r>
-            <w:r>
-              <w:rPr>
-                <w:rFonts w:ascii="Arial" w:hAnsi="Arial" w:cs="Arial"/>
-                <w:sz w:val="20"/>
-                <w:szCs w:val="20"/>
-                <w:lang w:val="pt-BR"/>
-              </w:rPr>
-              <w:t>(Nomes I – V)</w:t>
+              <w:t>computacional (Nomes I – V)</w:t>
             </w:r>
           </w:p>
         </w:tc>
@@ -7469,7 +6178,6 @@
                 <w:lang w:val="pt-BR"/>
               </w:rPr>
             </w:pPr>
-            <w:proofErr w:type="spellStart"/>
             <w:r>
               <w:rPr>
                 <w:rFonts w:ascii="Arial" w:hAnsi="Arial" w:cs="Arial"/>
@@ -7479,43 +6187,7 @@
                 <w:sz w:val="20"/>
                 <w:szCs w:val="20"/>
               </w:rPr>
-              <w:t>Prova</w:t>
-            </w:r>
-            <w:proofErr w:type="spellEnd"/>
-            <w:r>
-              <w:rPr>
-                <w:rFonts w:ascii="Arial" w:hAnsi="Arial" w:cs="Arial"/>
-                <w:b/>
-                <w:bCs/>
-                <w:color w:val="00B050"/>
-                <w:sz w:val="20"/>
-                <w:szCs w:val="20"/>
-              </w:rPr>
-              <w:t xml:space="preserve"> da </w:t>
-            </w:r>
-            <w:proofErr w:type="spellStart"/>
-            <w:r>
-              <w:rPr>
-                <w:rFonts w:ascii="Arial" w:hAnsi="Arial" w:cs="Arial"/>
-                <w:b/>
-                <w:bCs/>
-                <w:color w:val="00B050"/>
-                <w:sz w:val="20"/>
-                <w:szCs w:val="20"/>
-              </w:rPr>
-              <w:t>Unidade</w:t>
-            </w:r>
-            <w:proofErr w:type="spellEnd"/>
-            <w:r>
-              <w:rPr>
-                <w:rFonts w:ascii="Arial" w:hAnsi="Arial" w:cs="Arial"/>
-                <w:b/>
-                <w:bCs/>
-                <w:color w:val="00B050"/>
-                <w:sz w:val="20"/>
-                <w:szCs w:val="20"/>
-              </w:rPr>
-              <w:t xml:space="preserve"> </w:t>
+              <w:t xml:space="preserve">Prova da Unidade </w:t>
             </w:r>
             <w:r>
               <w:rPr>
@@ -7659,7 +6331,6 @@
                 <w:lang w:val="pt-BR"/>
               </w:rPr>
             </w:pPr>
-            <w:proofErr w:type="spellStart"/>
             <w:r>
               <w:rPr>
                 <w:rFonts w:ascii="Arial" w:hAnsi="Arial" w:cs="Arial"/>
@@ -7669,19 +6340,7 @@
                 <w:sz w:val="20"/>
                 <w:szCs w:val="20"/>
               </w:rPr>
-              <w:t>Prova</w:t>
-            </w:r>
-            <w:proofErr w:type="spellEnd"/>
-            <w:r>
-              <w:rPr>
-                <w:rFonts w:ascii="Arial" w:hAnsi="Arial" w:cs="Arial"/>
-                <w:b/>
-                <w:bCs/>
-                <w:color w:val="00B050"/>
-                <w:sz w:val="20"/>
-                <w:szCs w:val="20"/>
-              </w:rPr>
-              <w:t xml:space="preserve"> final</w:t>
+              <w:t>Prova final</w:t>
             </w:r>
           </w:p>
         </w:tc>
@@ -7765,7 +6424,7 @@
                 <w:szCs w:val="20"/>
                 <w:lang w:val="pt-BR"/>
               </w:rPr>
-              <w:t xml:space="preserve"> Exercício de participação 2</w:t>
+              <w:t xml:space="preserve"> Exercício de participação</w:t>
             </w:r>
           </w:p>
         </w:tc>

</xml_diff>